<commit_message>
Update read me.docx and remove temp file
Replace DD research/read me.docx with an updated binary version and delete the temporary Word lock file DD research/~$ead me.docx. This removes a leftover temp file and keeps the repository clean.
</commit_message>
<xml_diff>
--- a/DD research/read me.docx
+++ b/DD research/read me.docx
@@ -4,6 +4,7 @@
   <w:body>
     <w:p>
       <w:pPr>
+        <w:ind w:firstLine="720"/>
         <w:rPr>
           <w:b/>
           <w:bCs/>
@@ -18,7 +19,71 @@
           <w:sz w:val="28"/>
           <w:szCs w:val="28"/>
         </w:rPr>
-        <w:t xml:space="preserve">DDD diagram: </w:t>
+        <w:t xml:space="preserve">My </w:t>
+      </w:r>
+      <w:r>
+        <w:rPr>
+          <w:b/>
+          <w:bCs/>
+          <w:sz w:val="28"/>
+          <w:szCs w:val="28"/>
+        </w:rPr>
+        <w:t>research topic is</w:t>
+      </w:r>
+      <w:r>
+        <w:rPr>
+          <w:b/>
+          <w:bCs/>
+          <w:sz w:val="28"/>
+          <w:szCs w:val="28"/>
+        </w:rPr>
+        <w:t xml:space="preserve"> </w:t>
+      </w:r>
+      <w:r>
+        <w:rPr>
+          <w:b/>
+          <w:bCs/>
+          <w:sz w:val="28"/>
+          <w:szCs w:val="28"/>
+        </w:rPr>
+        <w:t>“</w:t>
+      </w:r>
+      <w:r>
+        <w:rPr>
+          <w:b/>
+          <w:bCs/>
+          <w:sz w:val="28"/>
+          <w:szCs w:val="28"/>
+        </w:rPr>
+        <w:t>ai driven drug discovery of potential antiviral for dengue with ml/dl</w:t>
+      </w:r>
+      <w:r>
+        <w:rPr>
+          <w:b/>
+          <w:bCs/>
+          <w:sz w:val="28"/>
+          <w:szCs w:val="28"/>
+        </w:rPr>
+        <w:t>”</w:t>
+      </w:r>
+    </w:p>
+    <w:p>
+      <w:pPr>
+        <w:rPr>
+          <w:b/>
+          <w:bCs/>
+          <w:sz w:val="28"/>
+          <w:szCs w:val="28"/>
+        </w:rPr>
+      </w:pPr>
+      <w:r>
+        <w:rPr>
+          <w:b/>
+          <w:bCs/>
+          <w:sz w:val="28"/>
+          <w:szCs w:val="28"/>
+        </w:rPr>
+        <w:t xml:space="preserve">diagram: </w:t>
       </w:r>
     </w:p>
     <w:p>
@@ -26,19 +91,9 @@
         <w:pStyle w:val="NoSpacing"/>
         <w:jc w:val="center"/>
       </w:pPr>
-      <w:proofErr w:type="spellStart"/>
-      <w:r>
-        <w:t>ChEMBL</w:t>
-      </w:r>
-      <w:proofErr w:type="spellEnd"/>
-      <w:r>
-        <w:t xml:space="preserve"> + </w:t>
-      </w:r>
-      <w:proofErr w:type="spellStart"/>
-      <w:r>
-        <w:t>BindingDB</w:t>
-      </w:r>
-      <w:proofErr w:type="spellEnd"/>
+      <w:r>
+        <w:t>ChEMBL + BindingDB</w:t>
+      </w:r>
     </w:p>
     <w:p>
       <w:pPr>
@@ -109,15 +164,7 @@
         <w:jc w:val="center"/>
       </w:pPr>
       <w:r>
-        <w:t xml:space="preserve">(Variance + Correlation + </w:t>
-      </w:r>
-      <w:proofErr w:type="spellStart"/>
-      <w:r>
-        <w:t>BorutaSHAP</w:t>
-      </w:r>
-      <w:proofErr w:type="spellEnd"/>
-      <w:r>
-        <w:t>)</w:t>
+        <w:t>(Variance + Correlation + BorutaSHAP)</w:t>
       </w:r>
     </w:p>
     <w:p>
@@ -138,15 +185,7 @@
         <w:jc w:val="center"/>
       </w:pPr>
       <w:r>
-        <w:t xml:space="preserve">RF vs </w:t>
-      </w:r>
-      <w:proofErr w:type="spellStart"/>
-      <w:r>
-        <w:t>XGBoost</w:t>
-      </w:r>
-      <w:proofErr w:type="spellEnd"/>
-      <w:r>
-        <w:t xml:space="preserve"> vs GNN</w:t>
+        <w:t>RF vs XGBoost vs GNN</w:t>
       </w:r>
       <w:r>
         <w:tab/>
@@ -407,6 +446,7 @@
           <w:b/>
           <w:bCs/>
         </w:rPr>
+        <w:lastRenderedPageBreak/>
         <w:t>Medicinal chemistry insights of molecular docking and cell permeability mechanism of phytoconstituents present in </w:t>
       </w:r>
       <w:r>
@@ -466,7 +506,6 @@
           <w:b/>
           <w:bCs/>
         </w:rPr>
-        <w:lastRenderedPageBreak/>
         <w:t>Cross-linking mass spectrometry and structural modeling identifies compact conformation of DENV NS2B cofactor region bound to NS3</w:t>
       </w:r>
       <w:r>
@@ -593,33 +632,7 @@
           <w:lang w:bidi="bn-BD"/>
           <w14:ligatures w14:val="none"/>
         </w:rPr>
-        <w:t xml:space="preserve">Evaluation of </w:t>
-      </w:r>
-      <w:proofErr w:type="spellStart"/>
-      <w:r>
-        <w:rPr>
-          <w:rFonts w:eastAsia="Times New Roman" w:cstheme="minorHAnsi"/>
-          <w:b/>
-          <w:bCs/>
-          <w:color w:val="FFFFFF"/>
-          <w:kern w:val="36"/>
-          <w:lang w:bidi="bn-BD"/>
-          <w14:ligatures w14:val="none"/>
-        </w:rPr>
-        <w:t>methoxyflavones</w:t>
-      </w:r>
-      <w:proofErr w:type="spellEnd"/>
-      <w:r>
-        <w:rPr>
-          <w:rFonts w:eastAsia="Times New Roman" w:cstheme="minorHAnsi"/>
-          <w:b/>
-          <w:bCs/>
-          <w:color w:val="FFFFFF"/>
-          <w:kern w:val="36"/>
-          <w:lang w:bidi="bn-BD"/>
-          <w14:ligatures w14:val="none"/>
-        </w:rPr>
-        <w:t xml:space="preserve"> as dengue NS2B–NS3 protease inhibitors: an in silico and in vitro studies</w:t>
+        <w:t>Evaluation of methoxyflavones as dengue NS2B–NS3 protease inhibitors: an in silico and in vitro studies</w:t>
       </w:r>
     </w:p>
     <w:p>
@@ -706,215 +719,2079 @@
           <w:numId w:val="1"/>
         </w:numPr>
         <w:rPr>
+          <w:lang w:val="en" w:bidi="bn-BD"/>
+        </w:rPr>
+      </w:pPr>
+      <w:r>
+        <w:rPr>
+          <w:lang w:val="en" w:bidi="bn-BD"/>
+        </w:rPr>
+        <w:t>Molecular dynamics-driven optimization of triterpenoid, amidinium, and flavonoid inhibitors targeting dengue NS2B-NS3 protease</w:t>
+      </w:r>
+      <w:r>
+        <w:rPr>
+          <w:lang w:val="en" w:bidi="bn-BD"/>
+        </w:rPr>
+        <w:t xml:space="preserve"> 2026</w:t>
+      </w:r>
+    </w:p>
+    <w:p>
+      <w:pPr>
+        <w:pStyle w:val="NoSpacing"/>
+        <w:ind w:left="360"/>
+        <w:rPr>
+          <w:lang w:val="en" w:bidi="bn-BD"/>
+        </w:rPr>
+      </w:pPr>
+      <w:r>
+        <w:rPr>
+          <w:lang w:val="en" w:bidi="bn-BD"/>
+        </w:rPr>
+        <w:t>https://www.sciencedirect.com/science/article/abs/pii/S1476927126001386</w:t>
+      </w:r>
+    </w:p>
+    <w:p>
+      <w:pPr>
+        <w:pStyle w:val="NoSpacing"/>
+        <w:numPr>
+          <w:ilvl w:val="0"/>
+          <w:numId w:val="1"/>
+        </w:numPr>
+        <w:rPr>
           <w:lang w:bidi="bn-BD"/>
         </w:rPr>
       </w:pPr>
-    </w:p>
-    <w:p>
-      <w:pPr>
-        <w:pStyle w:val="NoSpacing"/>
-      </w:pPr>
-    </w:p>
-    <w:p>
-      <w:pPr>
-        <w:pStyle w:val="NoSpacing"/>
+      <w:r>
+        <w:rPr>
+          <w:lang w:bidi="bn-BD"/>
+        </w:rPr>
+        <w:t>Exploring synthetic compounds and phytocompounds as potential inhibitors of DENV NS2B-NS3 protease through computational screening and simulation approaches</w:t>
+      </w:r>
+      <w:r>
+        <w:rPr>
+          <w:lang w:bidi="bn-BD"/>
+        </w:rPr>
+        <w:t xml:space="preserve"> 2026</w:t>
+      </w:r>
+    </w:p>
+    <w:p>
+      <w:pPr>
+        <w:pStyle w:val="NoSpacing"/>
+        <w:ind w:left="360"/>
+        <w:rPr>
+          <w:lang w:bidi="bn-BD"/>
+        </w:rPr>
+      </w:pPr>
+      <w:r>
+        <w:rPr>
+          <w:lang w:bidi="bn-BD"/>
+        </w:rPr>
+        <w:t>https://www.sciencedirect.com/science/article/pii/S3050787126000545</w:t>
+      </w:r>
+    </w:p>
+    <w:p>
+      <w:pPr>
+        <w:pStyle w:val="NoSpacing"/>
+        <w:numPr>
+          <w:ilvl w:val="0"/>
+          <w:numId w:val="1"/>
+        </w:numPr>
+        <w:rPr>
+          <w:lang w:bidi="bn-BD"/>
+        </w:rPr>
+      </w:pPr>
+      <w:r>
+        <w:rPr>
+          <w:lang w:bidi="bn-BD"/>
+        </w:rPr>
+        <w:t xml:space="preserve">Interpretable machine learning-driven identification of novel DENV NS2B-NS3 protease inhibitors through multi-stage virtual screening and experimental </w:t>
+      </w:r>
+      <w:r>
+        <w:rPr>
+          <w:lang w:bidi="bn-BD"/>
+        </w:rPr>
+        <w:t>validation 2026</w:t>
+      </w:r>
+    </w:p>
+    <w:p>
+      <w:pPr>
+        <w:pStyle w:val="NoSpacing"/>
+        <w:rPr>
+          <w:lang w:bidi="bn-BD"/>
+        </w:rPr>
+      </w:pPr>
+      <w:r>
+        <w:rPr>
+          <w:lang w:bidi="bn-BD"/>
+        </w:rPr>
+        <w:t>https://link.springer.com/article/10.1007/s11030-026-11473-x</w:t>
+      </w:r>
+    </w:p>
+    <w:p>
+      <w:pPr>
+        <w:pStyle w:val="NoSpacing"/>
+        <w:numPr>
+          <w:ilvl w:val="0"/>
+          <w:numId w:val="1"/>
+        </w:numPr>
+        <w:rPr>
+          <w:lang w:bidi="bn-BD"/>
+        </w:rPr>
+      </w:pPr>
+      <w:r>
+        <w:rPr>
+          <w:lang w:bidi="bn-BD"/>
+        </w:rPr>
+        <w:t>Achievements and Approaches in the Search for Small-Molecule Dengue NS2B/NS3 Inhibitors</w:t>
+      </w:r>
+    </w:p>
+    <w:p>
+      <w:pPr>
+        <w:pStyle w:val="NoSpacing"/>
+        <w:ind w:left="360"/>
+        <w:rPr>
+          <w:lang w:bidi="bn-BD"/>
+        </w:rPr>
+      </w:pPr>
+      <w:hyperlink r:id="rId10" w:history="1">
+        <w:r>
+          <w:rPr>
+            <w:rStyle w:val="Hyperlink"/>
+            <w:lang w:bidi="bn-BD"/>
+          </w:rPr>
+          <w:t>https://doi.org/10.2174/0109298673343582241229131338</w:t>
+        </w:r>
+      </w:hyperlink>
+    </w:p>
+    <w:p>
+      <w:pPr>
+        <w:pStyle w:val="NoSpacing"/>
+        <w:numPr>
+          <w:ilvl w:val="0"/>
+          <w:numId w:val="1"/>
+        </w:numPr>
+        <w:rPr>
+          <w:lang w:bidi="bn-BD"/>
+        </w:rPr>
+      </w:pPr>
+      <w:r>
+        <w:rPr>
+          <w:lang w:bidi="bn-BD"/>
+        </w:rPr>
+        <w:t>In-Silico Screening and Molecular Dynamics Evaluation of Spirulina Platensis-Derived Compounds as Potential Antiviral Agents Against Dengue Virus NS2b/NS3 Protease 2026</w:t>
+      </w:r>
+    </w:p>
+    <w:p>
+      <w:pPr>
+        <w:pStyle w:val="NoSpacing"/>
+        <w:ind w:left="360"/>
+        <w:rPr>
+          <w:lang w:bidi="bn-BD"/>
+        </w:rPr>
+      </w:pPr>
+      <w:hyperlink r:id="rId11" w:history="1">
+        <w:r>
+          <w:rPr>
+            <w:rStyle w:val="Hyperlink"/>
+            <w:lang w:bidi="bn-BD"/>
+          </w:rPr>
+          <w:t>https://doi.org/10.21203/rs.3.rs-9667555/v1</w:t>
+        </w:r>
+      </w:hyperlink>
+    </w:p>
+    <w:p>
+      <w:pPr>
+        <w:pStyle w:val="NoSpacing"/>
+        <w:numPr>
+          <w:ilvl w:val="0"/>
+          <w:numId w:val="1"/>
+        </w:numPr>
+        <w:rPr>
+          <w:lang w:bidi="bn-BD"/>
+        </w:rPr>
       </w:pPr>
       <w:r>
         <w:rPr>
           <w:b/>
           <w:bCs/>
-        </w:rPr>
-        <w:t>Findings</w:t>
-      </w:r>
-      <w:r>
-        <w:t xml:space="preserve">: </w:t>
+          <w:lang w:bidi="bn-BD"/>
+        </w:rPr>
+        <w:t>Marine Natural Products as Potential Inhibitors of NS2b/NS3-Protease of Dengue Virus: An In-Silico Approach</w:t>
       </w:r>
       <w:r>
         <w:rPr>
           <w:b/>
           <w:bCs/>
-        </w:rPr>
-        <w:t>1</w:t>
-      </w:r>
+          <w:lang w:bidi="bn-BD"/>
+        </w:rPr>
+        <w:t xml:space="preserve"> 2025</w:t>
+      </w:r>
+    </w:p>
+    <w:p>
+      <w:pPr>
+        <w:pStyle w:val="NoSpacing"/>
+        <w:ind w:left="360"/>
+        <w:rPr>
+          <w:rFonts w:ascii="Roboto" w:hAnsi="Roboto"/>
+          <w:color w:val="525254"/>
+          <w:sz w:val="21"/>
+          <w:szCs w:val="21"/>
+        </w:rPr>
+      </w:pPr>
+      <w:hyperlink r:id="rId12" w:tgtFrame="_blank" w:history="1">
+        <w:r>
+          <w:rPr>
+            <w:rStyle w:val="Hyperlink"/>
+            <w:rFonts w:ascii="inherit" w:hAnsi="inherit"/>
+            <w:sz w:val="21"/>
+            <w:szCs w:val="21"/>
+            <w:bdr w:val="none" w:sz="0" w:space="0" w:color="auto" w:frame="1"/>
+          </w:rPr>
+          <w:t>10.5750/ijme.v167iA3(S).1693</w:t>
+        </w:r>
+      </w:hyperlink>
+    </w:p>
+    <w:p>
+      <w:pPr>
+        <w:pStyle w:val="NoSpacing"/>
+        <w:numPr>
+          <w:ilvl w:val="0"/>
+          <w:numId w:val="1"/>
+        </w:numPr>
+        <w:rPr>
+          <w:lang w:bidi="bn-BD"/>
+        </w:rPr>
+      </w:pPr>
+      <w:r>
+        <w:rPr>
+          <w:lang w:bidi="bn-BD"/>
+        </w:rPr>
+        <w:t>Evaluating antiviral candidates for dengue virus infection: A review</w:t>
+      </w:r>
+      <w:r>
+        <w:rPr>
+          <w:lang w:bidi="bn-BD"/>
+        </w:rPr>
+        <w:t xml:space="preserve"> 2026</w:t>
+      </w:r>
+    </w:p>
+    <w:p>
+      <w:pPr>
+        <w:pStyle w:val="NoSpacing"/>
+        <w:numPr>
+          <w:ilvl w:val="0"/>
+          <w:numId w:val="1"/>
+        </w:numPr>
+        <w:rPr>
+          <w:lang w:bidi="bn-BD"/>
+        </w:rPr>
+      </w:pPr>
       <w:r>
         <w:rPr>
           <w:b/>
           <w:bCs/>
-        </w:rPr>
-        <w:t>(</w:t>
-      </w:r>
-      <w:r>
-        <w:t xml:space="preserve">done using HTVS, </w:t>
-      </w:r>
-      <w:r>
-        <w:t>molecular docking, molecular dynamics (MD) simulations, and binding free energy calculations</w:t>
-      </w:r>
-      <w:r>
+          <w:lang w:bidi="bn-BD"/>
+        </w:rPr>
+        <w:t>In Silico and in vitro antiviral activity of FDA approved drugs from ZINC database against RNA-dependent RNA polymerase of dengue virus</w:t>
+      </w:r>
+    </w:p>
+    <w:p>
+      <w:pPr>
+        <w:pStyle w:val="nova-legacy-e-listitem"/>
+        <w:shd w:val="clear" w:color="auto" w:fill="FFFFFF"/>
+        <w:spacing w:before="0" w:after="0"/>
+        <w:rPr>
+          <w:rFonts w:ascii="Roboto" w:hAnsi="Roboto"/>
+          <w:color w:val="525254"/>
+          <w:sz w:val="21"/>
+          <w:szCs w:val="21"/>
+        </w:rPr>
+      </w:pPr>
+      <w:hyperlink r:id="rId13" w:tgtFrame="_blank" w:history="1">
+        <w:r>
+          <w:rPr>
+            <w:rStyle w:val="Hyperlink"/>
+            <w:rFonts w:ascii="inherit" w:hAnsi="inherit"/>
+            <w:sz w:val="21"/>
+            <w:szCs w:val="21"/>
+            <w:bdr w:val="none" w:sz="0" w:space="0" w:color="auto" w:frame="1"/>
+          </w:rPr>
+          <w:t>10.1186/s12985-026-03110-8</w:t>
+        </w:r>
+      </w:hyperlink>
+    </w:p>
+    <w:p>
+      <w:pPr>
+        <w:pStyle w:val="NoSpacing"/>
+        <w:ind w:left="360"/>
+        <w:rPr>
+          <w:lang w:bidi="bn-BD"/>
+        </w:rPr>
+      </w:pPr>
+    </w:p>
+    <w:p>
+      <w:pPr>
+        <w:pStyle w:val="NoSpacing"/>
         <w:rPr>
           <w:b/>
           <w:bCs/>
         </w:rPr>
-        <w:t>)</w:t>
-      </w:r>
-      <w:r>
+      </w:pPr>
+    </w:p>
+    <w:tbl>
+      <w:tblPr>
+        <w:tblStyle w:val="TableGrid"/>
+        <w:tblW w:w="9901" w:type="dxa"/>
+        <w:tblLook w:val="04A0" w:firstRow="1" w:lastRow="0" w:firstColumn="1" w:lastColumn="0" w:noHBand="0" w:noVBand="1"/>
+      </w:tblPr>
+      <w:tblGrid>
+        <w:gridCol w:w="1256"/>
+        <w:gridCol w:w="1561"/>
+        <w:gridCol w:w="1506"/>
+        <w:gridCol w:w="1318"/>
+        <w:gridCol w:w="1104"/>
+        <w:gridCol w:w="1830"/>
+        <w:gridCol w:w="1326"/>
+      </w:tblGrid>
+      <w:tr>
+        <w:trPr>
+          <w:trHeight w:val="598"/>
+        </w:trPr>
+        <w:tc>
+          <w:tcPr>
+            <w:tcW w:w="1256" w:type="dxa"/>
+          </w:tcPr>
+          <w:p>
+            <w:pPr>
+              <w:pStyle w:val="NoSpacing"/>
+              <w:rPr>
+                <w:b/>
+                <w:bCs/>
+              </w:rPr>
+            </w:pPr>
+            <w:r>
+              <w:rPr>
+                <w:b/>
+                <w:bCs/>
+              </w:rPr>
+              <w:lastRenderedPageBreak/>
+              <w:t>Paper number</w:t>
+            </w:r>
+          </w:p>
+        </w:tc>
+        <w:tc>
+          <w:tcPr>
+            <w:tcW w:w="1561" w:type="dxa"/>
+          </w:tcPr>
+          <w:p>
+            <w:pPr>
+              <w:pStyle w:val="NoSpacing"/>
+              <w:rPr>
+                <w:b/>
+                <w:bCs/>
+              </w:rPr>
+            </w:pPr>
+            <w:r>
+              <w:rPr>
+                <w:b/>
+                <w:bCs/>
+              </w:rPr>
+              <w:t>Findings discovered</w:t>
+            </w:r>
+          </w:p>
+        </w:tc>
+        <w:tc>
+          <w:tcPr>
+            <w:tcW w:w="1506" w:type="dxa"/>
+          </w:tcPr>
+          <w:p>
+            <w:pPr>
+              <w:pStyle w:val="NoSpacing"/>
+              <w:rPr>
+                <w:b/>
+                <w:bCs/>
+              </w:rPr>
+            </w:pPr>
+            <w:r>
+              <w:rPr>
+                <w:b/>
+                <w:bCs/>
+              </w:rPr>
+              <w:t xml:space="preserve">Possible Molecules </w:t>
+            </w:r>
+          </w:p>
+        </w:tc>
+        <w:tc>
+          <w:tcPr>
+            <w:tcW w:w="1318" w:type="dxa"/>
+          </w:tcPr>
+          <w:p>
+            <w:pPr>
+              <w:pStyle w:val="NoSpacing"/>
+              <w:rPr>
+                <w:b/>
+                <w:bCs/>
+              </w:rPr>
+            </w:pPr>
+            <w:r>
+              <w:rPr>
+                <w:b/>
+                <w:bCs/>
+              </w:rPr>
+              <w:t>Method</w:t>
+            </w:r>
+          </w:p>
+        </w:tc>
+        <w:tc>
+          <w:tcPr>
+            <w:tcW w:w="1104" w:type="dxa"/>
+          </w:tcPr>
+          <w:p>
+            <w:pPr>
+              <w:pStyle w:val="NoSpacing"/>
+              <w:rPr>
+                <w:b/>
+                <w:bCs/>
+              </w:rPr>
+            </w:pPr>
+            <w:r>
+              <w:rPr>
+                <w:b/>
+                <w:bCs/>
+              </w:rPr>
+              <w:t xml:space="preserve">Accuracy </w:t>
+            </w:r>
+          </w:p>
+        </w:tc>
+        <w:tc>
+          <w:tcPr>
+            <w:tcW w:w="1830" w:type="dxa"/>
+          </w:tcPr>
+          <w:p>
+            <w:pPr>
+              <w:pStyle w:val="NoSpacing"/>
+              <w:rPr>
+                <w:b/>
+                <w:bCs/>
+              </w:rPr>
+            </w:pPr>
+            <w:r>
+              <w:rPr>
+                <w:b/>
+                <w:bCs/>
+              </w:rPr>
+              <w:t>Gap</w:t>
+            </w:r>
+          </w:p>
+        </w:tc>
+        <w:tc>
+          <w:tcPr>
+            <w:tcW w:w="1326" w:type="dxa"/>
+          </w:tcPr>
+          <w:p>
+            <w:pPr>
+              <w:pStyle w:val="NoSpacing"/>
+              <w:rPr>
+                <w:b/>
+                <w:bCs/>
+              </w:rPr>
+            </w:pPr>
+            <w:r>
+              <w:rPr>
+                <w:b/>
+                <w:bCs/>
+              </w:rPr>
+              <w:t>Better(y/n)</w:t>
+            </w:r>
+          </w:p>
+        </w:tc>
+      </w:tr>
+      <w:tr>
+        <w:trPr>
+          <w:trHeight w:val="292"/>
+        </w:trPr>
+        <w:tc>
+          <w:tcPr>
+            <w:tcW w:w="1256" w:type="dxa"/>
+          </w:tcPr>
+          <w:p>
+            <w:pPr>
+              <w:pStyle w:val="NoSpacing"/>
+              <w:rPr>
+                <w:b/>
+                <w:bCs/>
+              </w:rPr>
+            </w:pPr>
+            <w:r>
+              <w:rPr>
+                <w:b/>
+                <w:bCs/>
+              </w:rPr>
+              <w:t>1</w:t>
+            </w:r>
+          </w:p>
+        </w:tc>
+        <w:tc>
+          <w:tcPr>
+            <w:tcW w:w="1561" w:type="dxa"/>
+          </w:tcPr>
+          <w:p>
+            <w:pPr>
+              <w:pStyle w:val="NoSpacing"/>
+              <w:rPr>
+                <w:b/>
+                <w:bCs/>
+                <w:sz w:val="16"/>
+                <w:szCs w:val="16"/>
+              </w:rPr>
+            </w:pPr>
+            <w:r>
+              <w:rPr>
+                <w:sz w:val="16"/>
+                <w:szCs w:val="16"/>
+              </w:rPr>
+              <w:t>radius of gyration (RoG) and principal component analysis (PCA), to assess the stability, binding affinity, and dynamic behavior of protein-ligand complexes</w:t>
+            </w:r>
+          </w:p>
+        </w:tc>
+        <w:tc>
+          <w:tcPr>
+            <w:tcW w:w="1506" w:type="dxa"/>
+          </w:tcPr>
+          <w:p>
+            <w:pPr>
+              <w:pStyle w:val="NoSpacing"/>
+              <w:rPr>
+                <w:b/>
+                <w:bCs/>
+              </w:rPr>
+            </w:pPr>
+          </w:p>
+        </w:tc>
+        <w:tc>
+          <w:tcPr>
+            <w:tcW w:w="1318" w:type="dxa"/>
+          </w:tcPr>
+          <w:p>
+            <w:pPr>
+              <w:pStyle w:val="NoSpacing"/>
+              <w:rPr>
+                <w:b/>
+                <w:bCs/>
+                <w:sz w:val="16"/>
+                <w:szCs w:val="16"/>
+              </w:rPr>
+            </w:pPr>
+            <w:r>
+              <w:rPr>
+                <w:sz w:val="16"/>
+                <w:szCs w:val="16"/>
+              </w:rPr>
+              <w:t>done using HTVS, molecular docking, molecular dynamics (MD) simulations, and binding free energy calculations</w:t>
+            </w:r>
+          </w:p>
+        </w:tc>
+        <w:tc>
+          <w:tcPr>
+            <w:tcW w:w="1104" w:type="dxa"/>
+          </w:tcPr>
+          <w:p>
+            <w:pPr>
+              <w:pStyle w:val="NoSpacing"/>
+              <w:rPr>
+                <w:b/>
+                <w:bCs/>
+              </w:rPr>
+            </w:pPr>
+          </w:p>
+        </w:tc>
+        <w:tc>
+          <w:tcPr>
+            <w:tcW w:w="1830" w:type="dxa"/>
+          </w:tcPr>
+          <w:p>
+            <w:pPr>
+              <w:pStyle w:val="NoSpacing"/>
+              <w:rPr>
+                <w:sz w:val="20"/>
+                <w:szCs w:val="20"/>
+              </w:rPr>
+            </w:pPr>
+            <w:r>
+              <w:rPr>
+                <w:sz w:val="20"/>
+                <w:szCs w:val="20"/>
+              </w:rPr>
+              <w:t>No model trained</w:t>
+            </w:r>
+          </w:p>
+        </w:tc>
+        <w:tc>
+          <w:tcPr>
+            <w:tcW w:w="1326" w:type="dxa"/>
+          </w:tcPr>
+          <w:p>
+            <w:pPr>
+              <w:pStyle w:val="NoSpacing"/>
+              <w:rPr>
+                <w:b/>
+                <w:bCs/>
+              </w:rPr>
+            </w:pPr>
+            <w:r>
+              <w:rPr>
+                <w:b/>
+                <w:bCs/>
+              </w:rPr>
+              <w:t>50</w:t>
+            </w:r>
+          </w:p>
+        </w:tc>
+      </w:tr>
+      <w:tr>
+        <w:trPr>
+          <w:trHeight w:val="292"/>
+        </w:trPr>
+        <w:tc>
+          <w:tcPr>
+            <w:tcW w:w="1256" w:type="dxa"/>
+          </w:tcPr>
+          <w:p>
+            <w:pPr>
+              <w:pStyle w:val="NoSpacing"/>
+              <w:rPr>
+                <w:b/>
+                <w:bCs/>
+              </w:rPr>
+            </w:pPr>
+            <w:r>
+              <w:rPr>
+                <w:b/>
+                <w:bCs/>
+              </w:rPr>
+              <w:t>3</w:t>
+            </w:r>
+          </w:p>
+        </w:tc>
+        <w:tc>
+          <w:tcPr>
+            <w:tcW w:w="1561" w:type="dxa"/>
+          </w:tcPr>
+          <w:p>
+            <w:pPr>
+              <w:pStyle w:val="NoSpacing"/>
+              <w:rPr>
+                <w:b/>
+                <w:bCs/>
+                <w:sz w:val="16"/>
+                <w:szCs w:val="16"/>
+              </w:rPr>
+            </w:pPr>
+            <w:r>
+              <w:rPr>
+                <w:sz w:val="16"/>
+                <w:szCs w:val="16"/>
+              </w:rPr>
+              <w:t>They found a vital "gear"S48, it works on all versions of Dengue</w:t>
+            </w:r>
+          </w:p>
+        </w:tc>
+        <w:tc>
+          <w:tcPr>
+            <w:tcW w:w="1506" w:type="dxa"/>
+          </w:tcPr>
+          <w:p>
+            <w:pPr>
+              <w:pStyle w:val="NoSpacing"/>
+              <w:rPr>
+                <w:b/>
+                <w:bCs/>
+                <w:sz w:val="21"/>
+                <w:szCs w:val="21"/>
+              </w:rPr>
+            </w:pPr>
+            <w:r>
+              <w:rPr>
+                <w:b/>
+                <w:bCs/>
+                <w:sz w:val="21"/>
+                <w:szCs w:val="21"/>
+              </w:rPr>
+              <w:t>Target(</w:t>
+            </w:r>
+            <w:r>
+              <w:rPr>
+                <w:sz w:val="21"/>
+                <w:szCs w:val="21"/>
+              </w:rPr>
+              <w:t xml:space="preserve">S48) </w:t>
+            </w:r>
+          </w:p>
+        </w:tc>
+        <w:tc>
+          <w:tcPr>
+            <w:tcW w:w="1318" w:type="dxa"/>
+          </w:tcPr>
+          <w:p>
+            <w:pPr>
+              <w:pStyle w:val="NoSpacing"/>
+              <w:rPr>
+                <w:b/>
+                <w:bCs/>
+              </w:rPr>
+            </w:pPr>
+          </w:p>
+        </w:tc>
+        <w:tc>
+          <w:tcPr>
+            <w:tcW w:w="1104" w:type="dxa"/>
+          </w:tcPr>
+          <w:p>
+            <w:pPr>
+              <w:pStyle w:val="NoSpacing"/>
+              <w:rPr>
+                <w:b/>
+                <w:bCs/>
+              </w:rPr>
+            </w:pPr>
+          </w:p>
+        </w:tc>
+        <w:tc>
+          <w:tcPr>
+            <w:tcW w:w="1830" w:type="dxa"/>
+          </w:tcPr>
+          <w:p>
+            <w:pPr>
+              <w:pStyle w:val="NoSpacing"/>
+              <w:rPr>
+                <w:b/>
+                <w:bCs/>
+              </w:rPr>
+            </w:pPr>
+          </w:p>
+        </w:tc>
+        <w:tc>
+          <w:tcPr>
+            <w:tcW w:w="1326" w:type="dxa"/>
+          </w:tcPr>
+          <w:p>
+            <w:pPr>
+              <w:pStyle w:val="NoSpacing"/>
+              <w:rPr>
+                <w:b/>
+                <w:bCs/>
+              </w:rPr>
+            </w:pPr>
+          </w:p>
+        </w:tc>
+      </w:tr>
+      <w:tr>
+        <w:trPr>
+          <w:trHeight w:val="292"/>
+        </w:trPr>
+        <w:tc>
+          <w:tcPr>
+            <w:tcW w:w="1256" w:type="dxa"/>
+          </w:tcPr>
+          <w:p>
+            <w:pPr>
+              <w:pStyle w:val="NoSpacing"/>
+              <w:rPr>
+                <w:b/>
+                <w:bCs/>
+              </w:rPr>
+            </w:pPr>
+            <w:r>
+              <w:rPr>
+                <w:b/>
+                <w:bCs/>
+              </w:rPr>
+              <w:t>4</w:t>
+            </w:r>
+          </w:p>
+        </w:tc>
+        <w:tc>
+          <w:tcPr>
+            <w:tcW w:w="1561" w:type="dxa"/>
+          </w:tcPr>
+          <w:p>
+            <w:pPr>
+              <w:pStyle w:val="NoSpacing"/>
+              <w:rPr>
+                <w:sz w:val="16"/>
+                <w:szCs w:val="16"/>
+              </w:rPr>
+            </w:pPr>
+            <w:r>
+              <w:rPr>
+                <w:sz w:val="16"/>
+                <w:szCs w:val="16"/>
+                <w:lang w:bidi="bn-BD"/>
+              </w:rPr>
+              <w:t>phytochemicals derived from jackfruit a inhibitor</w:t>
+            </w:r>
+          </w:p>
+        </w:tc>
+        <w:tc>
+          <w:tcPr>
+            <w:tcW w:w="1506" w:type="dxa"/>
+          </w:tcPr>
+          <w:p>
+            <w:pPr>
+              <w:pStyle w:val="NoSpacing"/>
+              <w:rPr>
+                <w:b/>
+                <w:bCs/>
+              </w:rPr>
+            </w:pPr>
+            <w:r>
+              <w:rPr>
+                <w:b/>
+                <w:bCs/>
+              </w:rPr>
+              <w:t>Possible antiviral</w:t>
+            </w:r>
+          </w:p>
+        </w:tc>
+        <w:tc>
+          <w:tcPr>
+            <w:tcW w:w="1318" w:type="dxa"/>
+          </w:tcPr>
+          <w:p>
+            <w:pPr>
+              <w:pStyle w:val="NoSpacing"/>
+              <w:rPr>
+                <w:b/>
+                <w:bCs/>
+              </w:rPr>
+            </w:pPr>
+          </w:p>
+        </w:tc>
+        <w:tc>
+          <w:tcPr>
+            <w:tcW w:w="1104" w:type="dxa"/>
+          </w:tcPr>
+          <w:p>
+            <w:pPr>
+              <w:pStyle w:val="NoSpacing"/>
+              <w:rPr>
+                <w:b/>
+                <w:bCs/>
+              </w:rPr>
+            </w:pPr>
+          </w:p>
+        </w:tc>
+        <w:tc>
+          <w:tcPr>
+            <w:tcW w:w="1830" w:type="dxa"/>
+          </w:tcPr>
+          <w:p>
+            <w:pPr>
+              <w:pStyle w:val="NoSpacing"/>
+              <w:rPr>
+                <w:b/>
+                <w:bCs/>
+              </w:rPr>
+            </w:pPr>
+          </w:p>
+        </w:tc>
+        <w:tc>
+          <w:tcPr>
+            <w:tcW w:w="1326" w:type="dxa"/>
+          </w:tcPr>
+          <w:p>
+            <w:pPr>
+              <w:pStyle w:val="NoSpacing"/>
+              <w:rPr>
+                <w:b/>
+                <w:bCs/>
+              </w:rPr>
+            </w:pPr>
+          </w:p>
+        </w:tc>
+      </w:tr>
+      <w:tr>
+        <w:trPr>
+          <w:trHeight w:val="305"/>
+        </w:trPr>
+        <w:tc>
+          <w:tcPr>
+            <w:tcW w:w="1256" w:type="dxa"/>
+          </w:tcPr>
+          <w:p>
+            <w:pPr>
+              <w:pStyle w:val="NoSpacing"/>
+              <w:rPr>
+                <w:b/>
+                <w:bCs/>
+              </w:rPr>
+            </w:pPr>
+            <w:r>
+              <w:rPr>
+                <w:b/>
+                <w:bCs/>
+              </w:rPr>
+              <w:t>6</w:t>
+            </w:r>
+          </w:p>
+        </w:tc>
+        <w:tc>
+          <w:tcPr>
+            <w:tcW w:w="1561" w:type="dxa"/>
+          </w:tcPr>
+          <w:p>
+            <w:pPr>
+              <w:pStyle w:val="NoSpacing"/>
+              <w:rPr>
+                <w:b/>
+                <w:bCs/>
+                <w:sz w:val="16"/>
+                <w:szCs w:val="16"/>
+              </w:rPr>
+            </w:pPr>
+            <w:r>
+              <w:rPr>
+                <w:sz w:val="16"/>
+                <w:szCs w:val="16"/>
+                <w:lang w:bidi="bn-BD"/>
+              </w:rPr>
+              <w:t>FDA-approved drugs to identify potential inhibitor</w:t>
+            </w:r>
+          </w:p>
+        </w:tc>
+        <w:tc>
+          <w:tcPr>
+            <w:tcW w:w="1506" w:type="dxa"/>
+          </w:tcPr>
+          <w:p>
+            <w:pPr>
+              <w:pStyle w:val="NoSpacing"/>
+              <w:rPr>
+                <w:sz w:val="16"/>
+                <w:szCs w:val="16"/>
+              </w:rPr>
+            </w:pPr>
+            <w:r>
+              <w:rPr>
+                <w:sz w:val="16"/>
+                <w:szCs w:val="16"/>
+              </w:rPr>
+              <w:t>His51, Asp75, and Ser135, Dolutegravir </w:t>
+            </w:r>
+          </w:p>
+        </w:tc>
+        <w:tc>
+          <w:tcPr>
+            <w:tcW w:w="1318" w:type="dxa"/>
+          </w:tcPr>
+          <w:p>
+            <w:pPr>
+              <w:pStyle w:val="NoSpacing"/>
+              <w:rPr>
+                <w:sz w:val="16"/>
+                <w:szCs w:val="16"/>
+              </w:rPr>
+            </w:pPr>
+            <w:r>
+              <w:rPr>
+                <w:sz w:val="16"/>
+                <w:szCs w:val="16"/>
+              </w:rPr>
+              <w:t xml:space="preserve">screening of </w:t>
+            </w:r>
+            <w:r>
+              <w:rPr>
+                <w:b/>
+                <w:bCs/>
+                <w:sz w:val="16"/>
+                <w:szCs w:val="16"/>
+              </w:rPr>
+              <w:t>3109 of the FDA-approved drugs collected in the ZINC database</w:t>
+            </w:r>
+            <w:r>
+              <w:rPr>
+                <w:b/>
+                <w:bCs/>
+                <w:sz w:val="16"/>
+                <w:szCs w:val="16"/>
+              </w:rPr>
+              <w:t xml:space="preserve"> with PyRx</w:t>
+            </w:r>
+            <w:r>
+              <w:rPr>
+                <w:sz w:val="16"/>
+                <w:szCs w:val="16"/>
+              </w:rPr>
+              <w:t xml:space="preserve"> software</w:t>
+            </w:r>
+          </w:p>
+        </w:tc>
+        <w:tc>
+          <w:tcPr>
+            <w:tcW w:w="1104" w:type="dxa"/>
+          </w:tcPr>
+          <w:p>
+            <w:pPr>
+              <w:pStyle w:val="NoSpacing"/>
+              <w:rPr>
+                <w:b/>
+                <w:bCs/>
+              </w:rPr>
+            </w:pPr>
+          </w:p>
+        </w:tc>
+        <w:tc>
+          <w:tcPr>
+            <w:tcW w:w="1830" w:type="dxa"/>
+          </w:tcPr>
+          <w:p>
+            <w:pPr>
+              <w:pStyle w:val="NoSpacing"/>
+              <w:rPr>
+                <w:b/>
+                <w:bCs/>
+              </w:rPr>
+            </w:pPr>
+          </w:p>
+        </w:tc>
+        <w:tc>
+          <w:tcPr>
+            <w:tcW w:w="1326" w:type="dxa"/>
+          </w:tcPr>
+          <w:p>
+            <w:pPr>
+              <w:pStyle w:val="NoSpacing"/>
+              <w:rPr>
+                <w:b/>
+                <w:bCs/>
+              </w:rPr>
+            </w:pPr>
+          </w:p>
+        </w:tc>
+      </w:tr>
+      <w:tr>
+        <w:trPr>
+          <w:trHeight w:val="292"/>
+        </w:trPr>
+        <w:tc>
+          <w:tcPr>
+            <w:tcW w:w="1256" w:type="dxa"/>
+          </w:tcPr>
+          <w:p>
+            <w:pPr>
+              <w:pStyle w:val="NoSpacing"/>
+              <w:rPr>
+                <w:b/>
+                <w:bCs/>
+              </w:rPr>
+            </w:pPr>
+            <w:r>
+              <w:rPr>
+                <w:b/>
+                <w:bCs/>
+              </w:rPr>
+              <w:t>7</w:t>
+            </w:r>
+          </w:p>
+        </w:tc>
+        <w:tc>
+          <w:tcPr>
+            <w:tcW w:w="1561" w:type="dxa"/>
+          </w:tcPr>
+          <w:p>
+            <w:pPr>
+              <w:pStyle w:val="NoSpacing"/>
+              <w:rPr>
+                <w:sz w:val="16"/>
+                <w:szCs w:val="16"/>
+                <w:lang w:val="en"/>
+              </w:rPr>
+            </w:pPr>
+            <w:r>
+              <w:rPr>
+                <w:sz w:val="16"/>
+                <w:szCs w:val="16"/>
+                <w:lang w:val="en"/>
+              </w:rPr>
+              <w:t>Molecular dynamics-driven optimization of triterpenoid, amidinium, and flavonoid inhibitors targeting dengue NS2B-NS3 protease</w:t>
+            </w:r>
+          </w:p>
+        </w:tc>
+        <w:tc>
+          <w:tcPr>
+            <w:tcW w:w="1506" w:type="dxa"/>
+          </w:tcPr>
+          <w:p>
+            <w:pPr>
+              <w:pStyle w:val="NoSpacing"/>
+              <w:rPr>
+                <w:b/>
+                <w:bCs/>
+                <w:sz w:val="16"/>
+                <w:szCs w:val="16"/>
+              </w:rPr>
+            </w:pPr>
+            <w:r>
+              <w:rPr>
+                <w:b/>
+                <w:bCs/>
+                <w:sz w:val="16"/>
+                <w:szCs w:val="16"/>
+              </w:rPr>
+              <w:t>triterpenoid, amidinium, and flavonoid chemical classes</w:t>
+            </w:r>
+          </w:p>
+        </w:tc>
+        <w:tc>
+          <w:tcPr>
+            <w:tcW w:w="1318" w:type="dxa"/>
+          </w:tcPr>
+          <w:p>
+            <w:pPr>
+              <w:pStyle w:val="NoSpacing"/>
+              <w:rPr>
+                <w:sz w:val="16"/>
+                <w:szCs w:val="16"/>
+              </w:rPr>
+            </w:pPr>
+            <w:r>
+              <w:rPr>
+                <w:sz w:val="16"/>
+                <w:szCs w:val="16"/>
+              </w:rPr>
+              <w:t>MM/PBSA binding free energy calculations</w:t>
+            </w:r>
+          </w:p>
+          <w:p>
+            <w:pPr>
+              <w:pStyle w:val="NoSpacing"/>
+              <w:rPr>
+                <w:sz w:val="16"/>
+                <w:szCs w:val="16"/>
+              </w:rPr>
+            </w:pPr>
+            <w:r>
+              <w:rPr>
+                <w:sz w:val="16"/>
+                <w:szCs w:val="16"/>
+              </w:rPr>
+              <w:t>Molecular docking</w:t>
+            </w:r>
+          </w:p>
+          <w:p>
+            <w:pPr>
+              <w:pStyle w:val="NoSpacing"/>
+            </w:pPr>
+          </w:p>
+        </w:tc>
+        <w:tc>
+          <w:tcPr>
+            <w:tcW w:w="1104" w:type="dxa"/>
+          </w:tcPr>
+          <w:p>
+            <w:pPr>
+              <w:pStyle w:val="NoSpacing"/>
+              <w:rPr>
+                <w:b/>
+                <w:bCs/>
+              </w:rPr>
+            </w:pPr>
+          </w:p>
+        </w:tc>
+        <w:tc>
+          <w:tcPr>
+            <w:tcW w:w="1830" w:type="dxa"/>
+          </w:tcPr>
+          <w:p>
+            <w:pPr>
+              <w:pStyle w:val="NoSpacing"/>
+            </w:pPr>
+            <w:r>
+              <w:t>No model trained to screen</w:t>
+            </w:r>
+          </w:p>
+        </w:tc>
+        <w:tc>
+          <w:tcPr>
+            <w:tcW w:w="1326" w:type="dxa"/>
+          </w:tcPr>
+          <w:p>
+            <w:pPr>
+              <w:pStyle w:val="NoSpacing"/>
+              <w:rPr>
+                <w:b/>
+                <w:bCs/>
+              </w:rPr>
+            </w:pPr>
+          </w:p>
+        </w:tc>
+      </w:tr>
+      <w:tr>
+        <w:trPr>
+          <w:trHeight w:val="292"/>
+        </w:trPr>
+        <w:tc>
+          <w:tcPr>
+            <w:tcW w:w="1256" w:type="dxa"/>
+          </w:tcPr>
+          <w:p>
+            <w:pPr>
+              <w:pStyle w:val="NoSpacing"/>
+              <w:rPr>
+                <w:b/>
+                <w:bCs/>
+              </w:rPr>
+            </w:pPr>
+            <w:r>
+              <w:rPr>
+                <w:b/>
+                <w:bCs/>
+              </w:rPr>
+              <w:t>8</w:t>
+            </w:r>
+          </w:p>
+        </w:tc>
+        <w:tc>
+          <w:tcPr>
+            <w:tcW w:w="1561" w:type="dxa"/>
+          </w:tcPr>
+          <w:p>
+            <w:pPr>
+              <w:pStyle w:val="NoSpacing"/>
+              <w:rPr>
+                <w:sz w:val="16"/>
+                <w:szCs w:val="16"/>
+                <w:lang w:val="en"/>
+              </w:rPr>
+            </w:pPr>
+            <w:r>
+              <w:rPr>
+                <w:sz w:val="16"/>
+                <w:szCs w:val="16"/>
+                <w:lang w:bidi="bn-BD"/>
+              </w:rPr>
+              <w:t>synthetic compounds and phytocompounds as potential inhibitors</w:t>
+            </w:r>
+          </w:p>
+        </w:tc>
+        <w:tc>
+          <w:tcPr>
+            <w:tcW w:w="1506" w:type="dxa"/>
+          </w:tcPr>
+          <w:p>
+            <w:pPr>
+              <w:pStyle w:val="NoSpacing"/>
+              <w:rPr>
+                <w:sz w:val="16"/>
+                <w:szCs w:val="16"/>
+              </w:rPr>
+            </w:pPr>
+            <w:r>
+              <w:rPr>
+                <w:sz w:val="16"/>
+                <w:szCs w:val="16"/>
+              </w:rPr>
+              <w:t>PubChem CID: 136,448,014 binding affinity of -9.394 kcal/mol</w:t>
+            </w:r>
+          </w:p>
+        </w:tc>
+        <w:tc>
+          <w:tcPr>
+            <w:tcW w:w="1318" w:type="dxa"/>
+          </w:tcPr>
+          <w:p>
+            <w:pPr>
+              <w:pStyle w:val="NoSpacing"/>
+              <w:rPr>
+                <w:b/>
+                <w:bCs/>
+              </w:rPr>
+            </w:pPr>
+          </w:p>
+        </w:tc>
+        <w:tc>
+          <w:tcPr>
+            <w:tcW w:w="1104" w:type="dxa"/>
+          </w:tcPr>
+          <w:p>
+            <w:pPr>
+              <w:pStyle w:val="NoSpacing"/>
+              <w:rPr>
+                <w:b/>
+                <w:bCs/>
+              </w:rPr>
+            </w:pPr>
+          </w:p>
+        </w:tc>
+        <w:tc>
+          <w:tcPr>
+            <w:tcW w:w="1830" w:type="dxa"/>
+          </w:tcPr>
+          <w:p>
+            <w:pPr>
+              <w:pStyle w:val="NoSpacing"/>
+              <w:rPr>
+                <w:b/>
+                <w:bCs/>
+              </w:rPr>
+            </w:pPr>
+          </w:p>
+        </w:tc>
+        <w:tc>
+          <w:tcPr>
+            <w:tcW w:w="1326" w:type="dxa"/>
+          </w:tcPr>
+          <w:p>
+            <w:pPr>
+              <w:pStyle w:val="NoSpacing"/>
+              <w:rPr>
+                <w:b/>
+                <w:bCs/>
+              </w:rPr>
+            </w:pPr>
+          </w:p>
+        </w:tc>
+      </w:tr>
+      <w:tr>
+        <w:trPr>
+          <w:trHeight w:val="292"/>
+        </w:trPr>
+        <w:tc>
+          <w:tcPr>
+            <w:tcW w:w="1256" w:type="dxa"/>
+          </w:tcPr>
+          <w:p>
+            <w:pPr>
+              <w:pStyle w:val="NoSpacing"/>
+              <w:rPr>
+                <w:b/>
+                <w:bCs/>
+              </w:rPr>
+            </w:pPr>
+            <w:r>
+              <w:rPr>
+                <w:b/>
+                <w:bCs/>
+              </w:rPr>
+              <w:t>9</w:t>
+            </w:r>
+          </w:p>
+        </w:tc>
+        <w:tc>
+          <w:tcPr>
+            <w:tcW w:w="1561" w:type="dxa"/>
+          </w:tcPr>
+          <w:p>
+            <w:pPr>
+              <w:pStyle w:val="NoSpacing"/>
+              <w:rPr>
+                <w:sz w:val="16"/>
+                <w:szCs w:val="16"/>
+                <w:lang w:val="en"/>
+              </w:rPr>
+            </w:pPr>
+            <w:r>
+              <w:rPr>
+                <w:sz w:val="16"/>
+                <w:szCs w:val="16"/>
+              </w:rPr>
+              <w:t xml:space="preserve">Interpretable machine learning-driven identiﬁcation </w:t>
+            </w:r>
+            <w:r>
+              <w:rPr>
+                <w:sz w:val="16"/>
+                <w:szCs w:val="16"/>
+              </w:rPr>
+              <w:t xml:space="preserve"> </w:t>
+            </w:r>
+            <w:r>
+              <w:rPr>
+                <w:sz w:val="16"/>
+                <w:szCs w:val="16"/>
+              </w:rPr>
+              <w:t>multi-stage virtual screening</w:t>
+            </w:r>
+          </w:p>
+        </w:tc>
+        <w:tc>
+          <w:tcPr>
+            <w:tcW w:w="1506" w:type="dxa"/>
+          </w:tcPr>
+          <w:p>
+            <w:pPr>
+              <w:pStyle w:val="NoSpacing"/>
+              <w:rPr>
+                <w:b/>
+                <w:bCs/>
+                <w:sz w:val="16"/>
+                <w:szCs w:val="16"/>
+              </w:rPr>
+            </w:pPr>
+            <w:r>
+              <w:rPr>
+                <w:b/>
+                <w:bCs/>
+                <w:sz w:val="16"/>
+                <w:szCs w:val="16"/>
+              </w:rPr>
+              <w:t>compound 5</w:t>
+            </w:r>
+          </w:p>
+        </w:tc>
+        <w:tc>
+          <w:tcPr>
+            <w:tcW w:w="1318" w:type="dxa"/>
+          </w:tcPr>
+          <w:p>
+            <w:pPr>
+              <w:pStyle w:val="NoSpacing"/>
+              <w:rPr>
+                <w:b/>
+                <w:bCs/>
+                <w:sz w:val="16"/>
+                <w:szCs w:val="16"/>
+              </w:rPr>
+            </w:pPr>
+            <w:r>
+              <w:rPr>
+                <w:b/>
+                <w:bCs/>
+                <w:sz w:val="16"/>
+                <w:szCs w:val="16"/>
+              </w:rPr>
+              <w:t xml:space="preserve">  RF-ECFP and XGBoost-ECFP</w:t>
+            </w:r>
+          </w:p>
+        </w:tc>
+        <w:tc>
+          <w:tcPr>
+            <w:tcW w:w="1104" w:type="dxa"/>
+          </w:tcPr>
+          <w:p>
+            <w:pPr>
+              <w:pStyle w:val="NoSpacing"/>
+              <w:rPr>
+                <w:b/>
+                <w:bCs/>
+              </w:rPr>
+            </w:pPr>
+          </w:p>
+        </w:tc>
+        <w:tc>
+          <w:tcPr>
+            <w:tcW w:w="1830" w:type="dxa"/>
+          </w:tcPr>
+          <w:p>
+            <w:pPr>
+              <w:pStyle w:val="NoSpacing"/>
+              <w:rPr>
+                <w:b/>
+                <w:bCs/>
+              </w:rPr>
+            </w:pPr>
+            <w:r>
+              <w:rPr>
+                <w:b/>
+                <w:bCs/>
+              </w:rPr>
+              <w:t>requested</w:t>
+            </w:r>
+          </w:p>
+        </w:tc>
+        <w:tc>
+          <w:tcPr>
+            <w:tcW w:w="1326" w:type="dxa"/>
+          </w:tcPr>
+          <w:p>
+            <w:pPr>
+              <w:pStyle w:val="NoSpacing"/>
+              <w:rPr>
+                <w:b/>
+                <w:bCs/>
+              </w:rPr>
+            </w:pPr>
+          </w:p>
+        </w:tc>
+      </w:tr>
+      <w:tr>
+        <w:trPr>
+          <w:trHeight w:val="292"/>
+        </w:trPr>
+        <w:tc>
+          <w:tcPr>
+            <w:tcW w:w="1256" w:type="dxa"/>
+          </w:tcPr>
+          <w:p>
+            <w:pPr>
+              <w:pStyle w:val="NoSpacing"/>
+              <w:rPr>
+                <w:b/>
+                <w:bCs/>
+              </w:rPr>
+            </w:pPr>
+            <w:r>
+              <w:rPr>
+                <w:b/>
+                <w:bCs/>
+              </w:rPr>
+              <w:t>10</w:t>
+            </w:r>
+          </w:p>
+        </w:tc>
+        <w:tc>
+          <w:tcPr>
+            <w:tcW w:w="1561" w:type="dxa"/>
+          </w:tcPr>
+          <w:p>
+            <w:pPr>
+              <w:pStyle w:val="NoSpacing"/>
+              <w:rPr>
+                <w:sz w:val="16"/>
+                <w:szCs w:val="16"/>
+                <w:lang w:val="en"/>
+              </w:rPr>
+            </w:pPr>
+          </w:p>
+        </w:tc>
+        <w:tc>
+          <w:tcPr>
+            <w:tcW w:w="1506" w:type="dxa"/>
+          </w:tcPr>
+          <w:p>
+            <w:pPr>
+              <w:pStyle w:val="NoSpacing"/>
+              <w:rPr>
+                <w:b/>
+                <w:bCs/>
+                <w:sz w:val="16"/>
+                <w:szCs w:val="16"/>
+              </w:rPr>
+            </w:pPr>
+            <w:r>
+              <w:rPr>
+                <w:b/>
+                <w:bCs/>
+                <w:sz w:val="16"/>
+                <w:szCs w:val="16"/>
+              </w:rPr>
+              <w:t>Dengvaxia</w:t>
+            </w:r>
+            <w:r>
+              <w:rPr>
+                <w:b/>
+                <w:bCs/>
+                <w:sz w:val="16"/>
+                <w:szCs w:val="16"/>
+                <w:vertAlign w:val="superscript"/>
+              </w:rPr>
+              <w:t>®</w:t>
+            </w:r>
+            <w:r>
+              <w:rPr>
+                <w:b/>
+                <w:bCs/>
+                <w:sz w:val="16"/>
+                <w:szCs w:val="16"/>
+              </w:rPr>
+              <w:t> and Qdenga</w:t>
+            </w:r>
+            <w:r>
+              <w:rPr>
+                <w:b/>
+                <w:bCs/>
+                <w:sz w:val="16"/>
+                <w:szCs w:val="16"/>
+                <w:vertAlign w:val="superscript"/>
+              </w:rPr>
+              <w:t>®</w:t>
+            </w:r>
+          </w:p>
+        </w:tc>
+        <w:tc>
+          <w:tcPr>
+            <w:tcW w:w="1318" w:type="dxa"/>
+          </w:tcPr>
+          <w:p>
+            <w:pPr>
+              <w:pStyle w:val="NoSpacing"/>
+              <w:rPr>
+                <w:b/>
+                <w:bCs/>
+              </w:rPr>
+            </w:pPr>
+          </w:p>
+        </w:tc>
+        <w:tc>
+          <w:tcPr>
+            <w:tcW w:w="1104" w:type="dxa"/>
+          </w:tcPr>
+          <w:p>
+            <w:pPr>
+              <w:pStyle w:val="NoSpacing"/>
+              <w:rPr>
+                <w:b/>
+                <w:bCs/>
+              </w:rPr>
+            </w:pPr>
+          </w:p>
+        </w:tc>
+        <w:tc>
+          <w:tcPr>
+            <w:tcW w:w="1830" w:type="dxa"/>
+          </w:tcPr>
+          <w:p>
+            <w:pPr>
+              <w:pStyle w:val="NoSpacing"/>
+              <w:rPr>
+                <w:b/>
+                <w:bCs/>
+              </w:rPr>
+            </w:pPr>
+          </w:p>
+        </w:tc>
+        <w:tc>
+          <w:tcPr>
+            <w:tcW w:w="1326" w:type="dxa"/>
+          </w:tcPr>
+          <w:p>
+            <w:pPr>
+              <w:pStyle w:val="NoSpacing"/>
+              <w:rPr>
+                <w:b/>
+                <w:bCs/>
+              </w:rPr>
+            </w:pPr>
+          </w:p>
+        </w:tc>
+      </w:tr>
+      <w:tr>
+        <w:trPr>
+          <w:trHeight w:val="292"/>
+        </w:trPr>
+        <w:tc>
+          <w:tcPr>
+            <w:tcW w:w="1256" w:type="dxa"/>
+          </w:tcPr>
+          <w:p>
+            <w:pPr>
+              <w:pStyle w:val="NoSpacing"/>
+              <w:rPr>
+                <w:b/>
+                <w:bCs/>
+              </w:rPr>
+            </w:pPr>
+            <w:r>
+              <w:rPr>
+                <w:b/>
+                <w:bCs/>
+              </w:rPr>
+              <w:t>11</w:t>
+            </w:r>
+          </w:p>
+        </w:tc>
+        <w:tc>
+          <w:tcPr>
+            <w:tcW w:w="1561" w:type="dxa"/>
+          </w:tcPr>
+          <w:p>
+            <w:pPr>
+              <w:pStyle w:val="NoSpacing"/>
+              <w:rPr>
+                <w:sz w:val="16"/>
+                <w:szCs w:val="16"/>
+                <w:lang w:val="en"/>
+              </w:rPr>
+            </w:pPr>
+            <w:r>
+              <w:rPr>
+                <w:sz w:val="16"/>
+                <w:szCs w:val="16"/>
+              </w:rPr>
+              <w:t>Spirulina Platensis-Derived Compounds</w:t>
+            </w:r>
+          </w:p>
+        </w:tc>
+        <w:tc>
+          <w:tcPr>
+            <w:tcW w:w="1506" w:type="dxa"/>
+          </w:tcPr>
+          <w:p>
+            <w:pPr>
+              <w:pStyle w:val="NoSpacing"/>
+              <w:rPr>
+                <w:b/>
+                <w:bCs/>
+                <w:sz w:val="16"/>
+                <w:szCs w:val="16"/>
+              </w:rPr>
+            </w:pPr>
+            <w:r>
+              <w:rPr>
+                <w:b/>
+                <w:bCs/>
+                <w:sz w:val="16"/>
+                <w:szCs w:val="16"/>
+              </w:rPr>
+              <w:t xml:space="preserve">7 </w:t>
+            </w:r>
+            <w:r>
+              <w:rPr>
+                <w:b/>
+                <w:bCs/>
+                <w:sz w:val="16"/>
+                <w:szCs w:val="16"/>
+              </w:rPr>
+              <w:t>Spirulina-derived compounds</w:t>
+            </w:r>
+          </w:p>
+        </w:tc>
+        <w:tc>
+          <w:tcPr>
+            <w:tcW w:w="1318" w:type="dxa"/>
+          </w:tcPr>
+          <w:p>
+            <w:pPr>
+              <w:pStyle w:val="NoSpacing"/>
+              <w:rPr>
+                <w:sz w:val="16"/>
+                <w:szCs w:val="16"/>
+              </w:rPr>
+            </w:pPr>
+            <w:r>
+              <w:rPr>
+                <w:sz w:val="16"/>
+                <w:szCs w:val="16"/>
+              </w:rPr>
+              <w:t>virtual screening with AutoDock</w:t>
+            </w:r>
+          </w:p>
+        </w:tc>
+        <w:tc>
+          <w:tcPr>
+            <w:tcW w:w="1104" w:type="dxa"/>
+          </w:tcPr>
+          <w:p>
+            <w:pPr>
+              <w:pStyle w:val="NoSpacing"/>
+              <w:rPr>
+                <w:b/>
+                <w:bCs/>
+              </w:rPr>
+            </w:pPr>
+          </w:p>
+        </w:tc>
+        <w:tc>
+          <w:tcPr>
+            <w:tcW w:w="1830" w:type="dxa"/>
+          </w:tcPr>
+          <w:p>
+            <w:pPr>
+              <w:pStyle w:val="NoSpacing"/>
+              <w:rPr>
+                <w:b/>
+                <w:bCs/>
+              </w:rPr>
+            </w:pPr>
+          </w:p>
+        </w:tc>
+        <w:tc>
+          <w:tcPr>
+            <w:tcW w:w="1326" w:type="dxa"/>
+          </w:tcPr>
+          <w:p>
+            <w:pPr>
+              <w:pStyle w:val="NoSpacing"/>
+              <w:rPr>
+                <w:b/>
+                <w:bCs/>
+              </w:rPr>
+            </w:pPr>
+          </w:p>
+        </w:tc>
+      </w:tr>
+      <w:tr>
+        <w:trPr>
+          <w:trHeight w:val="292"/>
+        </w:trPr>
+        <w:tc>
+          <w:tcPr>
+            <w:tcW w:w="1256" w:type="dxa"/>
+          </w:tcPr>
+          <w:p>
+            <w:pPr>
+              <w:pStyle w:val="NoSpacing"/>
+              <w:rPr>
+                <w:b/>
+                <w:bCs/>
+              </w:rPr>
+            </w:pPr>
+            <w:r>
+              <w:rPr>
+                <w:b/>
+                <w:bCs/>
+              </w:rPr>
+              <w:t>12</w:t>
+            </w:r>
+          </w:p>
+        </w:tc>
+        <w:tc>
+          <w:tcPr>
+            <w:tcW w:w="1561" w:type="dxa"/>
+          </w:tcPr>
+          <w:p>
+            <w:pPr>
+              <w:pStyle w:val="NoSpacing"/>
+              <w:rPr>
+                <w:b/>
+                <w:bCs/>
+                <w:sz w:val="16"/>
+                <w:szCs w:val="16"/>
+                <w:lang w:val="en"/>
+              </w:rPr>
+            </w:pPr>
+            <w:r>
+              <w:rPr>
+                <w:b/>
+                <w:bCs/>
+                <w:sz w:val="16"/>
+                <w:szCs w:val="16"/>
+                <w:lang w:bidi="bn-BD"/>
+              </w:rPr>
+              <w:t>Evaluating antiviral candidates for dengue virus infection: A review</w:t>
+            </w:r>
+          </w:p>
+        </w:tc>
+        <w:tc>
+          <w:tcPr>
+            <w:tcW w:w="1506" w:type="dxa"/>
+          </w:tcPr>
+          <w:p>
+            <w:pPr>
+              <w:pStyle w:val="NoSpacing"/>
+              <w:rPr>
+                <w:b/>
+                <w:bCs/>
+                <w:sz w:val="16"/>
+                <w:szCs w:val="16"/>
+              </w:rPr>
+            </w:pPr>
+          </w:p>
+        </w:tc>
+        <w:tc>
+          <w:tcPr>
+            <w:tcW w:w="1318" w:type="dxa"/>
+          </w:tcPr>
+          <w:p>
+            <w:pPr>
+              <w:pStyle w:val="NoSpacing"/>
+              <w:rPr>
+                <w:b/>
+                <w:bCs/>
+              </w:rPr>
+            </w:pPr>
+          </w:p>
+        </w:tc>
+        <w:tc>
+          <w:tcPr>
+            <w:tcW w:w="1104" w:type="dxa"/>
+          </w:tcPr>
+          <w:p>
+            <w:pPr>
+              <w:pStyle w:val="NoSpacing"/>
+              <w:rPr>
+                <w:b/>
+                <w:bCs/>
+              </w:rPr>
+            </w:pPr>
+          </w:p>
+        </w:tc>
+        <w:tc>
+          <w:tcPr>
+            <w:tcW w:w="1830" w:type="dxa"/>
+          </w:tcPr>
+          <w:p>
+            <w:pPr>
+              <w:pStyle w:val="NoSpacing"/>
+              <w:rPr>
+                <w:b/>
+                <w:bCs/>
+              </w:rPr>
+            </w:pPr>
+          </w:p>
+        </w:tc>
+        <w:tc>
+          <w:tcPr>
+            <w:tcW w:w="1326" w:type="dxa"/>
+          </w:tcPr>
+          <w:p>
+            <w:pPr>
+              <w:pStyle w:val="NoSpacing"/>
+              <w:rPr>
+                <w:b/>
+                <w:bCs/>
+              </w:rPr>
+            </w:pPr>
+          </w:p>
+        </w:tc>
+      </w:tr>
+      <w:tr>
+        <w:trPr>
+          <w:trHeight w:val="292"/>
+        </w:trPr>
+        <w:tc>
+          <w:tcPr>
+            <w:tcW w:w="1256" w:type="dxa"/>
+          </w:tcPr>
+          <w:p>
+            <w:pPr>
+              <w:pStyle w:val="NoSpacing"/>
+              <w:rPr>
+                <w:b/>
+                <w:bCs/>
+              </w:rPr>
+            </w:pPr>
+            <w:r>
+              <w:rPr>
+                <w:b/>
+                <w:bCs/>
+              </w:rPr>
+              <w:t>13</w:t>
+            </w:r>
+          </w:p>
+        </w:tc>
+        <w:tc>
+          <w:tcPr>
+            <w:tcW w:w="1561" w:type="dxa"/>
+          </w:tcPr>
+          <w:p>
+            <w:pPr>
+              <w:pStyle w:val="NoSpacing"/>
+              <w:rPr>
+                <w:b/>
+                <w:bCs/>
+                <w:sz w:val="16"/>
+                <w:szCs w:val="16"/>
+              </w:rPr>
+            </w:pPr>
+            <w:r>
+              <w:rPr>
+                <w:b/>
+                <w:bCs/>
+                <w:sz w:val="16"/>
+                <w:szCs w:val="16"/>
+              </w:rPr>
+              <w:t>In Silico and in vitro antiviral activity of FDA approved drugs from ZINC database against RNA-dependent RNA polymerase of dengue virus</w:t>
+            </w:r>
+          </w:p>
+        </w:tc>
+        <w:tc>
+          <w:tcPr>
+            <w:tcW w:w="1506" w:type="dxa"/>
+          </w:tcPr>
+          <w:p>
+            <w:pPr>
+              <w:pStyle w:val="NoSpacing"/>
+              <w:rPr>
+                <w:b/>
+                <w:bCs/>
+                <w:sz w:val="16"/>
+                <w:szCs w:val="16"/>
+              </w:rPr>
+            </w:pPr>
+          </w:p>
+        </w:tc>
+        <w:tc>
+          <w:tcPr>
+            <w:tcW w:w="1318" w:type="dxa"/>
+          </w:tcPr>
+          <w:p>
+            <w:pPr>
+              <w:pStyle w:val="NoSpacing"/>
+              <w:rPr>
+                <w:sz w:val="16"/>
+                <w:szCs w:val="16"/>
+              </w:rPr>
+            </w:pPr>
+            <w:r>
+              <w:rPr>
+                <w:sz w:val="16"/>
+                <w:szCs w:val="16"/>
+              </w:rPr>
+              <w:t>VTS, moleculer docking, moleculer dynamic simulation</w:t>
+            </w:r>
+          </w:p>
+        </w:tc>
+        <w:tc>
+          <w:tcPr>
+            <w:tcW w:w="1104" w:type="dxa"/>
+          </w:tcPr>
+          <w:p>
+            <w:pPr>
+              <w:pStyle w:val="NoSpacing"/>
+              <w:rPr>
+                <w:b/>
+                <w:bCs/>
+              </w:rPr>
+            </w:pPr>
+          </w:p>
+        </w:tc>
+        <w:tc>
+          <w:tcPr>
+            <w:tcW w:w="1830" w:type="dxa"/>
+          </w:tcPr>
+          <w:p>
+            <w:pPr>
+              <w:pStyle w:val="NoSpacing"/>
+              <w:rPr>
+                <w:b/>
+                <w:bCs/>
+              </w:rPr>
+            </w:pPr>
+          </w:p>
+        </w:tc>
+        <w:tc>
+          <w:tcPr>
+            <w:tcW w:w="1326" w:type="dxa"/>
+          </w:tcPr>
+          <w:p>
+            <w:pPr>
+              <w:pStyle w:val="NoSpacing"/>
+              <w:rPr>
+                <w:b/>
+                <w:bCs/>
+              </w:rPr>
+            </w:pPr>
+          </w:p>
+        </w:tc>
+      </w:tr>
+    </w:tbl>
+    <w:p>
+      <w:pPr>
+        <w:pStyle w:val="NoSpacing"/>
         <w:rPr>
           <w:b/>
           <w:bCs/>
         </w:rPr>
-        <w:t>, 3(</w:t>
-      </w:r>
-      <w:r>
-        <w:t>They found a vital "gear"S48</w:t>
-      </w:r>
-      <w:r>
-        <w:t xml:space="preserve">, </w:t>
-      </w:r>
-      <w:r>
-        <w:t>it</w:t>
-      </w:r>
-      <w:r>
-        <w:t xml:space="preserve"> works on all versions of Dengue</w:t>
-      </w:r>
-      <w:r>
-        <w:rPr>
-          <w:b/>
-          <w:bCs/>
-        </w:rPr>
-        <w:t>)</w:t>
-      </w:r>
-      <w:r>
+      </w:pPr>
+    </w:p>
+    <w:p>
+      <w:pPr>
+        <w:pStyle w:val="NoSpacing"/>
+      </w:pPr>
+    </w:p>
+    <w:p>
+      <w:pPr>
+        <w:pStyle w:val="NoSpacing"/>
+      </w:pPr>
+    </w:p>
+    <w:p>
+      <w:pPr>
+        <w:pStyle w:val="NoSpacing"/>
+      </w:pPr>
+      <w:r>
+        <w:lastRenderedPageBreak/>
         <w:t xml:space="preserve"> </w:t>
       </w:r>
-      <w:r>
-        <w:rPr>
-          <w:b/>
-          <w:bCs/>
-        </w:rPr>
-        <w:t>4(</w:t>
-      </w:r>
-      <w:r>
-        <w:t>jackfruit phytochemicals inhibits with it</w:t>
-      </w:r>
-      <w:r>
-        <w:rPr>
-          <w:b/>
-          <w:bCs/>
-        </w:rPr>
-        <w:t>)</w:t>
-      </w:r>
-    </w:p>
-    <w:p>
-      <w:pPr>
-        <w:pStyle w:val="NoSpacing"/>
-        <w:rPr>
-          <w:b/>
-          <w:bCs/>
-        </w:rPr>
-      </w:pPr>
-      <w:r>
-        <w:rPr>
-          <w:b/>
-          <w:bCs/>
-        </w:rPr>
-        <w:t>analysis</w:t>
-      </w:r>
-      <w:r>
-        <w:t xml:space="preserve">: </w:t>
-      </w:r>
-      <w:r>
-        <w:t>1</w:t>
-      </w:r>
-      <w:r>
-        <w:rPr>
-          <w:b/>
-          <w:bCs/>
-        </w:rPr>
-        <w:t>(</w:t>
-      </w:r>
-      <w:r>
-        <w:t>radius of gyration (</w:t>
-      </w:r>
-      <w:proofErr w:type="spellStart"/>
-      <w:r>
-        <w:t>RoG</w:t>
-      </w:r>
-      <w:proofErr w:type="spellEnd"/>
-      <w:r>
-        <w:t>) and principal component analysis (PCA), to assess the stability, binding affinity, and dynamic behavior of protein-ligand complexes</w:t>
-      </w:r>
-      <w:r>
-        <w:rPr>
-          <w:b/>
-          <w:bCs/>
-        </w:rPr>
-        <w:t>)</w:t>
-      </w:r>
-    </w:p>
-    <w:p>
-      <w:pPr>
-        <w:pStyle w:val="NoSpacing"/>
-        <w:rPr>
-          <w:b/>
-          <w:bCs/>
-        </w:rPr>
-      </w:pPr>
-    </w:p>
-    <w:p>
-      <w:pPr>
-        <w:pStyle w:val="NoSpacing"/>
-      </w:pPr>
-      <w:r>
-        <w:rPr>
-          <w:b/>
-          <w:bCs/>
-        </w:rPr>
-        <w:t xml:space="preserve">founded inhibitor: </w:t>
-      </w:r>
-      <w:proofErr w:type="gramStart"/>
-      <w:r>
-        <w:rPr>
-          <w:b/>
-          <w:bCs/>
-        </w:rPr>
-        <w:t>4”</w:t>
-      </w:r>
-      <w:r>
-        <w:t>jackfruit</w:t>
-      </w:r>
-      <w:proofErr w:type="gramEnd"/>
-      <w:r>
-        <w:t xml:space="preserve"> phytochemicals</w:t>
-      </w:r>
-      <w:r>
-        <w:t xml:space="preserve">, </w:t>
-      </w:r>
-    </w:p>
-    <w:p>
-      <w:pPr>
-        <w:pStyle w:val="NoSpacing"/>
-        <w:rPr>
-          <w:b/>
-          <w:bCs/>
-        </w:rPr>
-      </w:pPr>
-    </w:p>
-    <w:p>
-      <w:pPr>
-        <w:pStyle w:val="NoSpacing"/>
-      </w:pPr>
-    </w:p>
-    <w:p>
-      <w:pPr>
-        <w:pStyle w:val="NoSpacing"/>
-      </w:pPr>
-    </w:p>
-    <w:p>
-      <w:pPr>
-        <w:pStyle w:val="NoSpacing"/>
-      </w:pPr>
-      <w:r>
-        <w:t xml:space="preserve"> </w:t>
-      </w:r>
     </w:p>
     <w:p>
       <w:pPr>
@@ -929,13 +2806,8 @@
         <w:pStyle w:val="NoSpacing"/>
       </w:pPr>
       <w:r>
-        <w:t xml:space="preserve">Validation: PubChem </w:t>
-      </w:r>
-      <w:proofErr w:type="spellStart"/>
-      <w:r>
-        <w:t>BioAssay</w:t>
-      </w:r>
-      <w:proofErr w:type="spellEnd"/>
+        <w:t>Validation: PubChem BioAssay</w:t>
+      </w:r>
     </w:p>
     <w:p/>
     <w:sectPr>
@@ -951,6 +2823,304 @@
 <file path=word/numbering.xml><?xml version="1.0" encoding="utf-8"?>
 <w:numbering xmlns:wpc="http://schemas.microsoft.com/office/word/2010/wordprocessingCanvas" xmlns:cx="http://schemas.microsoft.com/office/drawing/2014/chartex" xmlns:cx1="http://schemas.microsoft.com/office/drawing/2015/9/8/chartex" xmlns:cx2="http://schemas.microsoft.com/office/drawing/2015/10/21/chartex" xmlns:cx3="http://schemas.microsoft.com/office/drawing/2016/5/9/chartex" xmlns:cx4="http://schemas.microsoft.com/office/drawing/2016/5/10/chartex" xmlns:cx5="http://schemas.microsoft.com/office/drawing/2016/5/11/chartex" xmlns:cx6="http://schemas.microsoft.com/office/drawing/2016/5/12/chartex" xmlns:cx7="http://schemas.microsoft.com/office/drawing/2016/5/13/chartex" xmlns:cx8="http://schemas.microsoft.com/office/drawing/2016/5/14/chartex" xmlns:mc="http://schemas.openxmlformats.org/markup-compatibility/2006" xmlns:aink="http://schemas.microsoft.com/office/drawing/2016/ink" xmlns:am3d="http://schemas.microsoft.com/office/drawing/2017/model3d" xmlns:o="urn:schemas-microsoft-com:office:office" xmlns:oel="http://schemas.microsoft.com/office/2019/extlst" xmlns:r="http://schemas.openxmlformats.org/officeDocument/2006/relationships" xmlns:m="http://schemas.openxmlformats.org/officeDocument/2006/math" xmlns:v="urn:schemas-microsoft-com:vml" xmlns:wp14="http://schemas.microsoft.com/office/word/2010/wordprocessingDrawing" xmlns:wp="http://schemas.openxmlformats.org/drawingml/2006/wordprocessingDrawing" xmlns:w10="urn:schemas-microsoft-com:office:word" xmlns:w="http://schemas.openxmlformats.org/wordprocessingml/2006/main" xmlns:w14="http://schemas.microsoft.com/office/word/2010/wordml" xmlns:w15="http://schemas.microsoft.com/office/word/2012/wordml" xmlns:w16cex="http://schemas.microsoft.com/office/word/2018/wordml/cex" xmlns:w16cid="http://schemas.microsoft.com/office/word/2016/wordml/cid" xmlns:w16="http://schemas.microsoft.com/office/word/2018/wordml" xmlns:w16du="http://schemas.microsoft.com/office/word/2023/wordml/word16du" xmlns:w16sdtdh="http://schemas.microsoft.com/office/word/2020/wordml/sdtdatahash" xmlns:w16sdtfl="http://schemas.microsoft.com/office/word/2024/wordml/sdtformatlock" xmlns:w16se="http://schemas.microsoft.com/office/word/2015/wordml/symex" xmlns:wpg="http://schemas.microsoft.com/office/word/2010/wordprocessingGroup" xmlns:wpi="http://schemas.microsoft.com/office/word/2010/wordprocessingInk" xmlns:wne="http://schemas.microsoft.com/office/word/2006/wordml" xmlns:wps="http://schemas.microsoft.com/office/word/2010/wordprocessingShape" mc:Ignorable="w14 w15 w16se w16cid w16 w16cex w16sdtdh w16sdtfl w16du wp14">
   <w:abstractNum w:abstractNumId="0" w15:restartNumberingAfterBreak="0">
+    <w:nsid w:val="114B25A9"/>
+    <w:multiLevelType w:val="multilevel"/>
+    <w:tmpl w:val="F8D0F19C"/>
+    <w:lvl w:ilvl="0">
+      <w:start w:val="1"/>
+      <w:numFmt w:val="bullet"/>
+      <w:lvlText w:val=""/>
+      <w:lvlJc w:val="left"/>
+      <w:pPr>
+        <w:tabs>
+          <w:tab w:val="num" w:pos="720"/>
+        </w:tabs>
+        <w:ind w:left="720" w:hanging="360"/>
+      </w:pPr>
+      <w:rPr>
+        <w:rFonts w:ascii="Symbol" w:hAnsi="Symbol" w:hint="default"/>
+        <w:sz w:val="20"/>
+      </w:rPr>
+    </w:lvl>
+    <w:lvl w:ilvl="1" w:tentative="1">
+      <w:start w:val="1"/>
+      <w:numFmt w:val="bullet"/>
+      <w:lvlText w:val="o"/>
+      <w:lvlJc w:val="left"/>
+      <w:pPr>
+        <w:tabs>
+          <w:tab w:val="num" w:pos="1440"/>
+        </w:tabs>
+        <w:ind w:left="1440" w:hanging="360"/>
+      </w:pPr>
+      <w:rPr>
+        <w:rFonts w:ascii="Courier New" w:hAnsi="Courier New" w:hint="default"/>
+        <w:sz w:val="20"/>
+      </w:rPr>
+    </w:lvl>
+    <w:lvl w:ilvl="2" w:tentative="1">
+      <w:start w:val="1"/>
+      <w:numFmt w:val="bullet"/>
+      <w:lvlText w:val=""/>
+      <w:lvlJc w:val="left"/>
+      <w:pPr>
+        <w:tabs>
+          <w:tab w:val="num" w:pos="2160"/>
+        </w:tabs>
+        <w:ind w:left="2160" w:hanging="360"/>
+      </w:pPr>
+      <w:rPr>
+        <w:rFonts w:ascii="Wingdings" w:hAnsi="Wingdings" w:hint="default"/>
+        <w:sz w:val="20"/>
+      </w:rPr>
+    </w:lvl>
+    <w:lvl w:ilvl="3" w:tentative="1">
+      <w:start w:val="1"/>
+      <w:numFmt w:val="bullet"/>
+      <w:lvlText w:val=""/>
+      <w:lvlJc w:val="left"/>
+      <w:pPr>
+        <w:tabs>
+          <w:tab w:val="num" w:pos="2880"/>
+        </w:tabs>
+        <w:ind w:left="2880" w:hanging="360"/>
+      </w:pPr>
+      <w:rPr>
+        <w:rFonts w:ascii="Wingdings" w:hAnsi="Wingdings" w:hint="default"/>
+        <w:sz w:val="20"/>
+      </w:rPr>
+    </w:lvl>
+    <w:lvl w:ilvl="4" w:tentative="1">
+      <w:start w:val="1"/>
+      <w:numFmt w:val="bullet"/>
+      <w:lvlText w:val=""/>
+      <w:lvlJc w:val="left"/>
+      <w:pPr>
+        <w:tabs>
+          <w:tab w:val="num" w:pos="3600"/>
+        </w:tabs>
+        <w:ind w:left="3600" w:hanging="360"/>
+      </w:pPr>
+      <w:rPr>
+        <w:rFonts w:ascii="Wingdings" w:hAnsi="Wingdings" w:hint="default"/>
+        <w:sz w:val="20"/>
+      </w:rPr>
+    </w:lvl>
+    <w:lvl w:ilvl="5" w:tentative="1">
+      <w:start w:val="1"/>
+      <w:numFmt w:val="bullet"/>
+      <w:lvlText w:val=""/>
+      <w:lvlJc w:val="left"/>
+      <w:pPr>
+        <w:tabs>
+          <w:tab w:val="num" w:pos="4320"/>
+        </w:tabs>
+        <w:ind w:left="4320" w:hanging="360"/>
+      </w:pPr>
+      <w:rPr>
+        <w:rFonts w:ascii="Wingdings" w:hAnsi="Wingdings" w:hint="default"/>
+        <w:sz w:val="20"/>
+      </w:rPr>
+    </w:lvl>
+    <w:lvl w:ilvl="6" w:tentative="1">
+      <w:start w:val="1"/>
+      <w:numFmt w:val="bullet"/>
+      <w:lvlText w:val=""/>
+      <w:lvlJc w:val="left"/>
+      <w:pPr>
+        <w:tabs>
+          <w:tab w:val="num" w:pos="5040"/>
+        </w:tabs>
+        <w:ind w:left="5040" w:hanging="360"/>
+      </w:pPr>
+      <w:rPr>
+        <w:rFonts w:ascii="Wingdings" w:hAnsi="Wingdings" w:hint="default"/>
+        <w:sz w:val="20"/>
+      </w:rPr>
+    </w:lvl>
+    <w:lvl w:ilvl="7" w:tentative="1">
+      <w:start w:val="1"/>
+      <w:numFmt w:val="bullet"/>
+      <w:lvlText w:val=""/>
+      <w:lvlJc w:val="left"/>
+      <w:pPr>
+        <w:tabs>
+          <w:tab w:val="num" w:pos="5760"/>
+        </w:tabs>
+        <w:ind w:left="5760" w:hanging="360"/>
+      </w:pPr>
+      <w:rPr>
+        <w:rFonts w:ascii="Wingdings" w:hAnsi="Wingdings" w:hint="default"/>
+        <w:sz w:val="20"/>
+      </w:rPr>
+    </w:lvl>
+    <w:lvl w:ilvl="8" w:tentative="1">
+      <w:start w:val="1"/>
+      <w:numFmt w:val="bullet"/>
+      <w:lvlText w:val=""/>
+      <w:lvlJc w:val="left"/>
+      <w:pPr>
+        <w:tabs>
+          <w:tab w:val="num" w:pos="6480"/>
+        </w:tabs>
+        <w:ind w:left="6480" w:hanging="360"/>
+      </w:pPr>
+      <w:rPr>
+        <w:rFonts w:ascii="Wingdings" w:hAnsi="Wingdings" w:hint="default"/>
+        <w:sz w:val="20"/>
+      </w:rPr>
+    </w:lvl>
+  </w:abstractNum>
+  <w:abstractNum w:abstractNumId="1" w15:restartNumberingAfterBreak="0">
+    <w:nsid w:val="400657A4"/>
+    <w:multiLevelType w:val="multilevel"/>
+    <w:tmpl w:val="DB5864C6"/>
+    <w:lvl w:ilvl="0">
+      <w:start w:val="1"/>
+      <w:numFmt w:val="bullet"/>
+      <w:lvlText w:val=""/>
+      <w:lvlJc w:val="left"/>
+      <w:pPr>
+        <w:tabs>
+          <w:tab w:val="num" w:pos="720"/>
+        </w:tabs>
+        <w:ind w:left="720" w:hanging="360"/>
+      </w:pPr>
+      <w:rPr>
+        <w:rFonts w:ascii="Symbol" w:hAnsi="Symbol" w:hint="default"/>
+        <w:sz w:val="20"/>
+      </w:rPr>
+    </w:lvl>
+    <w:lvl w:ilvl="1" w:tentative="1">
+      <w:start w:val="1"/>
+      <w:numFmt w:val="bullet"/>
+      <w:lvlText w:val="o"/>
+      <w:lvlJc w:val="left"/>
+      <w:pPr>
+        <w:tabs>
+          <w:tab w:val="num" w:pos="1440"/>
+        </w:tabs>
+        <w:ind w:left="1440" w:hanging="360"/>
+      </w:pPr>
+      <w:rPr>
+        <w:rFonts w:ascii="Courier New" w:hAnsi="Courier New" w:hint="default"/>
+        <w:sz w:val="20"/>
+      </w:rPr>
+    </w:lvl>
+    <w:lvl w:ilvl="2" w:tentative="1">
+      <w:start w:val="1"/>
+      <w:numFmt w:val="bullet"/>
+      <w:lvlText w:val=""/>
+      <w:lvlJc w:val="left"/>
+      <w:pPr>
+        <w:tabs>
+          <w:tab w:val="num" w:pos="2160"/>
+        </w:tabs>
+        <w:ind w:left="2160" w:hanging="360"/>
+      </w:pPr>
+      <w:rPr>
+        <w:rFonts w:ascii="Wingdings" w:hAnsi="Wingdings" w:hint="default"/>
+        <w:sz w:val="20"/>
+      </w:rPr>
+    </w:lvl>
+    <w:lvl w:ilvl="3" w:tentative="1">
+      <w:start w:val="1"/>
+      <w:numFmt w:val="bullet"/>
+      <w:lvlText w:val=""/>
+      <w:lvlJc w:val="left"/>
+      <w:pPr>
+        <w:tabs>
+          <w:tab w:val="num" w:pos="2880"/>
+        </w:tabs>
+        <w:ind w:left="2880" w:hanging="360"/>
+      </w:pPr>
+      <w:rPr>
+        <w:rFonts w:ascii="Wingdings" w:hAnsi="Wingdings" w:hint="default"/>
+        <w:sz w:val="20"/>
+      </w:rPr>
+    </w:lvl>
+    <w:lvl w:ilvl="4" w:tentative="1">
+      <w:start w:val="1"/>
+      <w:numFmt w:val="bullet"/>
+      <w:lvlText w:val=""/>
+      <w:lvlJc w:val="left"/>
+      <w:pPr>
+        <w:tabs>
+          <w:tab w:val="num" w:pos="3600"/>
+        </w:tabs>
+        <w:ind w:left="3600" w:hanging="360"/>
+      </w:pPr>
+      <w:rPr>
+        <w:rFonts w:ascii="Wingdings" w:hAnsi="Wingdings" w:hint="default"/>
+        <w:sz w:val="20"/>
+      </w:rPr>
+    </w:lvl>
+    <w:lvl w:ilvl="5" w:tentative="1">
+      <w:start w:val="1"/>
+      <w:numFmt w:val="bullet"/>
+      <w:lvlText w:val=""/>
+      <w:lvlJc w:val="left"/>
+      <w:pPr>
+        <w:tabs>
+          <w:tab w:val="num" w:pos="4320"/>
+        </w:tabs>
+        <w:ind w:left="4320" w:hanging="360"/>
+      </w:pPr>
+      <w:rPr>
+        <w:rFonts w:ascii="Wingdings" w:hAnsi="Wingdings" w:hint="default"/>
+        <w:sz w:val="20"/>
+      </w:rPr>
+    </w:lvl>
+    <w:lvl w:ilvl="6" w:tentative="1">
+      <w:start w:val="1"/>
+      <w:numFmt w:val="bullet"/>
+      <w:lvlText w:val=""/>
+      <w:lvlJc w:val="left"/>
+      <w:pPr>
+        <w:tabs>
+          <w:tab w:val="num" w:pos="5040"/>
+        </w:tabs>
+        <w:ind w:left="5040" w:hanging="360"/>
+      </w:pPr>
+      <w:rPr>
+        <w:rFonts w:ascii="Wingdings" w:hAnsi="Wingdings" w:hint="default"/>
+        <w:sz w:val="20"/>
+      </w:rPr>
+    </w:lvl>
+    <w:lvl w:ilvl="7" w:tentative="1">
+      <w:start w:val="1"/>
+      <w:numFmt w:val="bullet"/>
+      <w:lvlText w:val=""/>
+      <w:lvlJc w:val="left"/>
+      <w:pPr>
+        <w:tabs>
+          <w:tab w:val="num" w:pos="5760"/>
+        </w:tabs>
+        <w:ind w:left="5760" w:hanging="360"/>
+      </w:pPr>
+      <w:rPr>
+        <w:rFonts w:ascii="Wingdings" w:hAnsi="Wingdings" w:hint="default"/>
+        <w:sz w:val="20"/>
+      </w:rPr>
+    </w:lvl>
+    <w:lvl w:ilvl="8" w:tentative="1">
+      <w:start w:val="1"/>
+      <w:numFmt w:val="bullet"/>
+      <w:lvlText w:val=""/>
+      <w:lvlJc w:val="left"/>
+      <w:pPr>
+        <w:tabs>
+          <w:tab w:val="num" w:pos="6480"/>
+        </w:tabs>
+        <w:ind w:left="6480" w:hanging="360"/>
+      </w:pPr>
+      <w:rPr>
+        <w:rFonts w:ascii="Wingdings" w:hAnsi="Wingdings" w:hint="default"/>
+        <w:sz w:val="20"/>
+      </w:rPr>
+    </w:lvl>
+  </w:abstractNum>
+  <w:abstractNum w:abstractNumId="2" w15:restartNumberingAfterBreak="0">
     <w:nsid w:val="573B27A5"/>
     <w:multiLevelType w:val="hybridMultilevel"/>
     <w:tmpl w:val="8D58D2B6"/>
@@ -1039,8 +3209,166 @@
       </w:pPr>
     </w:lvl>
   </w:abstractNum>
+  <w:abstractNum w:abstractNumId="3" w15:restartNumberingAfterBreak="0">
+    <w:nsid w:val="5A9542CC"/>
+    <w:multiLevelType w:val="multilevel"/>
+    <w:tmpl w:val="8020C126"/>
+    <w:lvl w:ilvl="0">
+      <w:start w:val="1"/>
+      <w:numFmt w:val="bullet"/>
+      <w:lvlText w:val=""/>
+      <w:lvlJc w:val="left"/>
+      <w:pPr>
+        <w:tabs>
+          <w:tab w:val="num" w:pos="720"/>
+        </w:tabs>
+        <w:ind w:left="720" w:hanging="360"/>
+      </w:pPr>
+      <w:rPr>
+        <w:rFonts w:ascii="Symbol" w:hAnsi="Symbol" w:hint="default"/>
+        <w:sz w:val="20"/>
+      </w:rPr>
+    </w:lvl>
+    <w:lvl w:ilvl="1" w:tentative="1">
+      <w:start w:val="1"/>
+      <w:numFmt w:val="bullet"/>
+      <w:lvlText w:val="o"/>
+      <w:lvlJc w:val="left"/>
+      <w:pPr>
+        <w:tabs>
+          <w:tab w:val="num" w:pos="1440"/>
+        </w:tabs>
+        <w:ind w:left="1440" w:hanging="360"/>
+      </w:pPr>
+      <w:rPr>
+        <w:rFonts w:ascii="Courier New" w:hAnsi="Courier New" w:hint="default"/>
+        <w:sz w:val="20"/>
+      </w:rPr>
+    </w:lvl>
+    <w:lvl w:ilvl="2" w:tentative="1">
+      <w:start w:val="1"/>
+      <w:numFmt w:val="bullet"/>
+      <w:lvlText w:val=""/>
+      <w:lvlJc w:val="left"/>
+      <w:pPr>
+        <w:tabs>
+          <w:tab w:val="num" w:pos="2160"/>
+        </w:tabs>
+        <w:ind w:left="2160" w:hanging="360"/>
+      </w:pPr>
+      <w:rPr>
+        <w:rFonts w:ascii="Wingdings" w:hAnsi="Wingdings" w:hint="default"/>
+        <w:sz w:val="20"/>
+      </w:rPr>
+    </w:lvl>
+    <w:lvl w:ilvl="3" w:tentative="1">
+      <w:start w:val="1"/>
+      <w:numFmt w:val="bullet"/>
+      <w:lvlText w:val=""/>
+      <w:lvlJc w:val="left"/>
+      <w:pPr>
+        <w:tabs>
+          <w:tab w:val="num" w:pos="2880"/>
+        </w:tabs>
+        <w:ind w:left="2880" w:hanging="360"/>
+      </w:pPr>
+      <w:rPr>
+        <w:rFonts w:ascii="Wingdings" w:hAnsi="Wingdings" w:hint="default"/>
+        <w:sz w:val="20"/>
+      </w:rPr>
+    </w:lvl>
+    <w:lvl w:ilvl="4" w:tentative="1">
+      <w:start w:val="1"/>
+      <w:numFmt w:val="bullet"/>
+      <w:lvlText w:val=""/>
+      <w:lvlJc w:val="left"/>
+      <w:pPr>
+        <w:tabs>
+          <w:tab w:val="num" w:pos="3600"/>
+        </w:tabs>
+        <w:ind w:left="3600" w:hanging="360"/>
+      </w:pPr>
+      <w:rPr>
+        <w:rFonts w:ascii="Wingdings" w:hAnsi="Wingdings" w:hint="default"/>
+        <w:sz w:val="20"/>
+      </w:rPr>
+    </w:lvl>
+    <w:lvl w:ilvl="5" w:tentative="1">
+      <w:start w:val="1"/>
+      <w:numFmt w:val="bullet"/>
+      <w:lvlText w:val=""/>
+      <w:lvlJc w:val="left"/>
+      <w:pPr>
+        <w:tabs>
+          <w:tab w:val="num" w:pos="4320"/>
+        </w:tabs>
+        <w:ind w:left="4320" w:hanging="360"/>
+      </w:pPr>
+      <w:rPr>
+        <w:rFonts w:ascii="Wingdings" w:hAnsi="Wingdings" w:hint="default"/>
+        <w:sz w:val="20"/>
+      </w:rPr>
+    </w:lvl>
+    <w:lvl w:ilvl="6" w:tentative="1">
+      <w:start w:val="1"/>
+      <w:numFmt w:val="bullet"/>
+      <w:lvlText w:val=""/>
+      <w:lvlJc w:val="left"/>
+      <w:pPr>
+        <w:tabs>
+          <w:tab w:val="num" w:pos="5040"/>
+        </w:tabs>
+        <w:ind w:left="5040" w:hanging="360"/>
+      </w:pPr>
+      <w:rPr>
+        <w:rFonts w:ascii="Wingdings" w:hAnsi="Wingdings" w:hint="default"/>
+        <w:sz w:val="20"/>
+      </w:rPr>
+    </w:lvl>
+    <w:lvl w:ilvl="7" w:tentative="1">
+      <w:start w:val="1"/>
+      <w:numFmt w:val="bullet"/>
+      <w:lvlText w:val=""/>
+      <w:lvlJc w:val="left"/>
+      <w:pPr>
+        <w:tabs>
+          <w:tab w:val="num" w:pos="5760"/>
+        </w:tabs>
+        <w:ind w:left="5760" w:hanging="360"/>
+      </w:pPr>
+      <w:rPr>
+        <w:rFonts w:ascii="Wingdings" w:hAnsi="Wingdings" w:hint="default"/>
+        <w:sz w:val="20"/>
+      </w:rPr>
+    </w:lvl>
+    <w:lvl w:ilvl="8" w:tentative="1">
+      <w:start w:val="1"/>
+      <w:numFmt w:val="bullet"/>
+      <w:lvlText w:val=""/>
+      <w:lvlJc w:val="left"/>
+      <w:pPr>
+        <w:tabs>
+          <w:tab w:val="num" w:pos="6480"/>
+        </w:tabs>
+        <w:ind w:left="6480" w:hanging="360"/>
+      </w:pPr>
+      <w:rPr>
+        <w:rFonts w:ascii="Wingdings" w:hAnsi="Wingdings" w:hint="default"/>
+        <w:sz w:val="20"/>
+      </w:rPr>
+    </w:lvl>
+  </w:abstractNum>
   <w:num w:numId="1" w16cid:durableId="1420717098">
+    <w:abstractNumId w:val="2"/>
+  </w:num>
+  <w:num w:numId="2" w16cid:durableId="1352418231">
     <w:abstractNumId w:val="0"/>
+  </w:num>
+  <w:num w:numId="3" w16cid:durableId="582373262">
+    <w:abstractNumId w:val="3"/>
+  </w:num>
+  <w:num w:numId="4" w16cid:durableId="753282158">
+    <w:abstractNumId w:val="1"/>
   </w:num>
 </w:numbering>
 </file>
@@ -1497,7 +3825,6 @@
     <w:next w:val="Normal"/>
     <w:link w:val="Heading3Char"/>
     <w:uiPriority w:val="9"/>
-    <w:semiHidden/>
     <w:unhideWhenUsed/>
     <w:qFormat/>
     <w:rsid w:val="007E7ED1"/>
@@ -1649,6 +3976,7 @@
   <w:style w:type="character" w:default="1" w:styleId="DefaultParagraphFont">
     <w:name w:val="Default Paragraph Font"/>
     <w:uiPriority w:val="1"/>
+    <w:semiHidden/>
     <w:unhideWhenUsed/>
   </w:style>
   <w:style w:type="table" w:default="1" w:styleId="TableNormal">
@@ -1704,7 +4032,6 @@
     <w:basedOn w:val="DefaultParagraphFont"/>
     <w:link w:val="Heading3"/>
     <w:uiPriority w:val="9"/>
-    <w:semiHidden/>
     <w:rsid w:val="007E7ED1"/>
     <w:rPr>
       <w:rFonts w:eastAsiaTheme="majorEastAsia" w:cstheme="majorBidi"/>
@@ -2010,6 +4337,51 @@
       <w:iCs/>
     </w:rPr>
   </w:style>
+  <w:style w:type="table" w:styleId="TableGrid">
+    <w:name w:val="Table Grid"/>
+    <w:basedOn w:val="TableNormal"/>
+    <w:uiPriority w:val="39"/>
+    <w:rsid w:val="00DE22A2"/>
+    <w:pPr>
+      <w:spacing w:after="0" w:line="240" w:lineRule="auto"/>
+    </w:pPr>
+    <w:tblPr>
+      <w:tblBorders>
+        <w:top w:val="single" w:sz="4" w:space="0" w:color="auto"/>
+        <w:left w:val="single" w:sz="4" w:space="0" w:color="auto"/>
+        <w:bottom w:val="single" w:sz="4" w:space="0" w:color="auto"/>
+        <w:right w:val="single" w:sz="4" w:space="0" w:color="auto"/>
+        <w:insideH w:val="single" w:sz="4" w:space="0" w:color="auto"/>
+        <w:insideV w:val="single" w:sz="4" w:space="0" w:color="auto"/>
+      </w:tblBorders>
+    </w:tblPr>
+  </w:style>
+  <w:style w:type="character" w:styleId="FollowedHyperlink">
+    <w:name w:val="FollowedHyperlink"/>
+    <w:basedOn w:val="DefaultParagraphFont"/>
+    <w:uiPriority w:val="99"/>
+    <w:semiHidden/>
+    <w:unhideWhenUsed/>
+    <w:rsid w:val="006C2A71"/>
+    <w:rPr>
+      <w:color w:val="954F72" w:themeColor="followedHyperlink"/>
+      <w:u w:val="single"/>
+    </w:rPr>
+  </w:style>
+  <w:style w:type="paragraph" w:customStyle="1" w:styleId="nova-legacy-e-listitem">
+    <w:name w:val="nova-legacy-e-list__item"/>
+    <w:basedOn w:val="Normal"/>
+    <w:rsid w:val="00C63AE7"/>
+    <w:pPr>
+      <w:spacing w:before="100" w:beforeAutospacing="1" w:after="100" w:afterAutospacing="1" w:line="240" w:lineRule="auto"/>
+    </w:pPr>
+    <w:rPr>
+      <w:rFonts w:ascii="Times New Roman" w:eastAsia="Times New Roman" w:hAnsi="Times New Roman" w:cs="Times New Roman"/>
+      <w:kern w:val="0"/>
+      <w:lang w:bidi="bn-BD"/>
+      <w14:ligatures w14:val="none"/>
+    </w:rPr>
+  </w:style>
 </w:styles>
 </file>
 

</xml_diff>